<commit_message>
docs: rewrite DEMO_SCRIPT, JUDGE_QA, and ARCHITECTURE with latest features, beginner explanations, and technical depth
</commit_message>
<xml_diff>
--- a/docs/ARCHITECTURE_new.docx
+++ b/docs/ARCHITECTURE_new.docx
@@ -4,2156 +4,1457 @@
   <w:body>
     <w:p>
       <w:pPr>
-        <w:pStyle w:val="Heading1"/>
-        <w:spacing w:before="240" w:after="120"/>
+        <w:spacing w:after="80"/>
+        <w:jc w:val="center"/>
       </w:pPr>
       <w:r>
         <w:rPr>
           <w:rFonts w:ascii="Calibri" w:hAnsi="Calibri"/>
           <w:b/>
-          <w:color w:val="0F2A4A"/>
-          <w:sz w:val="36"/>
+          <w:color w:val="003366"/>
+          <w:sz w:val="48"/>
         </w:rPr>
-        <w:t>🏛️ SIH26006: System Architecture &amp; Data Flow Specification</w:t>
+        <w:t>Freight DSS | SIH26006</w:t>
       </w:r>
     </w:p>
     <w:p>
       <w:pPr>
-        <w:spacing w:before="80" w:after="80"/>
-        <w:ind w:left="432"/>
+        <w:spacing w:after="160"/>
+        <w:jc w:val="center"/>
+      </w:pPr>
+      <w:r>
+        <w:rPr>
+          <w:rFonts w:ascii="Calibri" w:hAnsi="Calibri"/>
+          <w:i/>
+          <w:color w:val="1E5A96"/>
+          <w:sz w:val="26"/>
+        </w:rPr>
+        <w:t>End-to-End System Architecture &amp; Enterprise Technical Specification</w:t>
+      </w:r>
+    </w:p>
+    <w:p>
+      <w:pPr>
+        <w:spacing w:after="360"/>
+        <w:jc w:val="center"/>
       </w:pPr>
       <w:r>
         <w:rPr>
           <w:rFonts w:ascii="Calibri" w:hAnsi="Calibri"/>
           <w:b/>
-          <w:color w:val="1E3A5F"/>
-          <w:sz w:val="21"/>
+          <w:color w:val="323232"/>
+          <w:sz w:val="19"/>
         </w:rPr>
-        <w:t>Project</w:t>
-      </w:r>
-      <w:r>
-        <w:rPr>
-          <w:rFonts w:ascii="Calibri" w:hAnsi="Calibri"/>
-          <w:i/>
-          <w:color w:val="1E3A5F"/>
-          <w:sz w:val="21"/>
-        </w:rPr>
-        <w:t>: Intelligent Freight Forecasting Model for Optimized Vessel Chartering</w:t>
+        <w:t>Ministry of Steel (Government of India) | System: Full-Stack Decision Support System (DSS) | Stack: Next.js 14 | FastAPI | Neon PostgreSQL | LightGBM | Prophet | PuLP MILP | Document Version: 2.0.0 Production Release</w:t>
       </w:r>
     </w:p>
     <w:p>
       <w:pPr>
-        <w:spacing w:before="80" w:after="80"/>
-        <w:ind w:left="432"/>
+        <w:spacing w:after="240"/>
+        <w:pBdr>
+          <w:bottom w:val="single" w:sz="12" w:space="1" w:color="003366"/>
+        </w:pBdr>
+      </w:pPr>
+    </w:p>
+    <w:tbl>
+      <w:tblPr>
+        <w:tblW w:type="auto" w:w="0"/>
+        <w:jc w:val="center"/>
+        <w:tblLayout w:type="fixed"/>
+        <w:tblLook w:firstColumn="1" w:firstRow="1" w:lastColumn="0" w:lastRow="0" w:noHBand="0" w:noVBand="1" w:val="04A0"/>
+      </w:tblPr>
+      <w:tblGrid>
+        <w:gridCol w:w="9360"/>
+      </w:tblGrid>
+      <w:tr>
+        <w:tc>
+          <w:tcPr>
+            <w:tcW w:type="dxa" w:w="9360"/>
+            <w:shd w:fill="F0F4F8"/>
+            <w:tcMar>
+              <w:top w:w="140" w:type="dxa"/>
+              <w:bottom w:w="140" w:type="dxa"/>
+              <w:left w:w="200" w:type="dxa"/>
+              <w:right w:w="180" w:type="dxa"/>
+            </w:tcMar>
+            <w:tcBorders>
+              <w:left w:val="single" w:sz="24" w:space="0" w:color="003366"/>
+              <w:top w:val="none"/>
+              <w:right w:val="none"/>
+              <w:bottom w:val="none"/>
+            </w:tcBorders>
+          </w:tcPr>
+          <w:p>
+            <w:pPr>
+              <w:spacing w:after="40"/>
+            </w:pPr>
+            <w:r>
+              <w:rPr>
+                <w:rFonts w:ascii="Calibri" w:hAnsi="Calibri"/>
+                <w:b/>
+                <w:color w:val="003366"/>
+                <w:sz w:val="22"/>
+              </w:rPr>
+              <w:t>📌 EXECUTIVE ARCHITECTURAL SUMMARY</w:t>
+              <w:br/>
+            </w:r>
+            <w:r>
+              <w:rPr>
+                <w:rFonts w:ascii="Calibri" w:hAnsi="Calibri"/>
+                <w:color w:val="323232"/>
+                <w:sz w:val="20"/>
+              </w:rPr>
+              <w:t>Freight DSS is engineered as a decoupled, zero-downtime Decision Support System that unifies 25 years of global maritime market telemetry with operations research algorithms. This document details all 6 architectural layers, database schemas, REST APIs, machine learning pipelines, and the complete mathematical formulation of the MILP solver.</w:t>
+            </w:r>
+          </w:p>
+        </w:tc>
+      </w:tr>
+    </w:tbl>
+    <w:p>
+      <w:pPr>
+        <w:spacing w:after="120"/>
+      </w:pPr>
+    </w:p>
+    <w:p>
+      <w:pPr>
+        <w:keepNext/>
+        <w:spacing w:before="320" w:after="120"/>
       </w:pPr>
       <w:r>
         <w:rPr>
           <w:rFonts w:ascii="Calibri" w:hAnsi="Calibri"/>
           <w:b/>
-          <w:color w:val="1E3A5F"/>
-          <w:sz w:val="21"/>
+          <w:color w:val="003366"/>
+          <w:sz w:val="32"/>
         </w:rPr>
-        <w:t>Target Entity</w:t>
-      </w:r>
-      <w:r>
-        <w:rPr>
-          <w:rFonts w:ascii="Calibri" w:hAnsi="Calibri"/>
-          <w:i/>
-          <w:color w:val="1E3A5F"/>
-          <w:sz w:val="21"/>
-        </w:rPr>
-        <w:t>: Ministry of Steel (Government of India) &amp; Steel PSUs (SAIL, RINL, NMDC)</w:t>
+        <w:t>1. High-Level Architectural Topology</w:t>
       </w:r>
     </w:p>
     <w:p>
       <w:pPr>
-        <w:spacing w:before="80" w:after="80"/>
-        <w:ind w:left="432"/>
+        <w:spacing w:after="80" w:line="276" w:lineRule="auto"/>
+      </w:pPr>
+      <w:r>
+        <w:rPr>
+          <w:rFonts w:ascii="Calibri" w:hAnsi="Calibri"/>
+          <w:color w:val="323232"/>
+          <w:sz w:val="21"/>
+        </w:rPr>
+        <w:t>The system follows a six-tier modular design separating data ingestion, persistent storage, asynchronous backend services, hybrid predictive modeling, operations research optimization, and reactive client presentation:</w:t>
+      </w:r>
+    </w:p>
+    <w:p>
+      <w:pPr>
+        <w:pStyle w:val="ListBullet"/>
+        <w:spacing w:after="60" w:line="276" w:lineRule="auto"/>
       </w:pPr>
       <w:r>
         <w:rPr>
           <w:rFonts w:ascii="Calibri" w:hAnsi="Calibri"/>
           <w:b/>
-          <w:color w:val="1E3A5F"/>
+          <w:color w:val="323232"/>
           <w:sz w:val="21"/>
         </w:rPr>
-        <w:t>Version</w:t>
+        <w:t xml:space="preserve">Layer 1: External Telemetry &amp; Ingestion: </w:t>
       </w:r>
       <w:r>
         <w:rPr>
           <w:rFonts w:ascii="Calibri" w:hAnsi="Calibri"/>
-          <w:i/>
-          <w:color w:val="1E3A5F"/>
+          <w:color w:val="323232"/>
           <w:sz w:val="21"/>
         </w:rPr>
-        <w:t>: 1.0.0 Enterprise Production Specification</w:t>
+        <w:t>Ingests 25-year Kaggle historical Baltic Dry Index datasets, live Yahoo Finance market feeds (Brent Crude, USD/INR), and Indian major port operational telemetry.</w:t>
       </w:r>
     </w:p>
     <w:p>
       <w:pPr>
-        <w:spacing w:before="40" w:after="80"/>
-      </w:pPr>
-      <w:r>
-        <w:rPr>
-          <w:rFonts w:ascii="Calibri" w:hAnsi="Calibri"/>
-          <w:sz w:val="21"/>
-        </w:rPr>
-        <w:t>---</w:t>
-      </w:r>
-    </w:p>
-    <w:p>
-      <w:pPr>
-        <w:pStyle w:val="Heading2"/>
-        <w:spacing w:before="200" w:after="80"/>
+        <w:pStyle w:val="ListBullet"/>
+        <w:spacing w:after="60" w:line="276" w:lineRule="auto"/>
       </w:pPr>
       <w:r>
         <w:rPr>
           <w:rFonts w:ascii="Calibri" w:hAnsi="Calibri"/>
           <w:b/>
-          <w:color w:val="1B365D"/>
-          <w:sz w:val="28"/>
+          <w:color w:val="323232"/>
+          <w:sz w:val="21"/>
         </w:rPr>
-        <w:t>1. End-to-End System Architecture Overview</w:t>
+        <w:t xml:space="preserve">Layer 2: Storage &amp; Persistence: </w:t>
+      </w:r>
+      <w:r>
+        <w:rPr>
+          <w:rFonts w:ascii="Calibri" w:hAnsi="Calibri"/>
+          <w:color w:val="323232"/>
+          <w:sz w:val="21"/>
+        </w:rPr>
+        <w:t>Serverless PostgreSQL on Neon DB with connection pooling and time-series tables, paired with an automatic zero-downtime SQLite fallback for local development.</w:t>
       </w:r>
     </w:p>
     <w:p>
       <w:pPr>
-        <w:spacing w:before="40" w:after="80"/>
-      </w:pPr>
-      <w:r>
-        <w:rPr>
-          <w:rFonts w:ascii="Calibri" w:hAnsi="Calibri"/>
-          <w:sz w:val="21"/>
-        </w:rPr>
-        <w:t>The system is architected as a high-performance, modular Decision Support System (DSS) comprising five decoupled layers:</w:t>
-      </w:r>
-    </w:p>
-    <w:p>
-      <w:pPr>
-        <w:spacing w:before="80" w:after="120"/>
-        <w:ind w:left="360"/>
-      </w:pPr>
-      <w:r>
-        <w:rPr>
-          <w:rFonts w:ascii="Consolas" w:hAnsi="Consolas"/>
-          <w:color w:val="1F2937"/>
-          <w:sz w:val="18"/>
-        </w:rPr>
-        <w:t>[ Data Ingestion Layer ] ──► [ TimescaleDB Storage ] ──► [ FastAPI Core API ] ──► [ Next.js 14 UI ]</w:t>
-        <w:br/>
-        <w:t xml:space="preserve">                                                              │       ▲</w:t>
-        <w:br/>
-        <w:t xml:space="preserve">                                                              ▼       │</w:t>
-        <w:br/>
-        <w:t xml:space="preserve">                                                    [ ML Forecasting Engine ]</w:t>
-        <w:br/>
-        <w:t xml:space="preserve">                                                              │</w:t>
-        <w:br/>
-        <w:t xml:space="preserve">                                                              ▼</w:t>
-        <w:br/>
-        <w:t xml:space="preserve">                                                    [ PuLP MILP Solver ]</w:t>
-      </w:r>
-    </w:p>
-    <w:p>
-      <w:pPr>
-        <w:spacing w:before="40" w:after="80"/>
-      </w:pPr>
-      <w:r>
-        <w:rPr>
-          <w:rFonts w:ascii="Calibri" w:hAnsi="Calibri"/>
-          <w:sz w:val="21"/>
-        </w:rPr>
-        <w:t>---</w:t>
-      </w:r>
-    </w:p>
-    <w:p>
-      <w:pPr>
-        <w:pStyle w:val="Heading2"/>
-        <w:spacing w:before="200" w:after="80"/>
+        <w:pStyle w:val="ListBullet"/>
+        <w:spacing w:after="60" w:line="276" w:lineRule="auto"/>
       </w:pPr>
       <w:r>
         <w:rPr>
           <w:rFonts w:ascii="Calibri" w:hAnsi="Calibri"/>
           <w:b/>
-          <w:color w:val="1B365D"/>
-          <w:sz w:val="28"/>
+          <w:color w:val="323232"/>
+          <w:sz w:val="21"/>
         </w:rPr>
-        <w:t>2. Layer-by-Layer Architectural Decomposition</w:t>
+        <w:t xml:space="preserve">Layer 3: Asynchronous Backend API: </w:t>
+      </w:r>
+      <w:r>
+        <w:rPr>
+          <w:rFonts w:ascii="Calibri" w:hAnsi="Calibri"/>
+          <w:color w:val="323232"/>
+          <w:sz w:val="21"/>
+        </w:rPr>
+        <w:t>High-throughput FastAPI service running under Uvicorn ASGI with strict Pydantic V2 schemas, dynamic Render PORT binding, and bulletproof CORS preflight handling.</w:t>
       </w:r>
     </w:p>
     <w:p>
       <w:pPr>
-        <w:pStyle w:val="Heading3"/>
-        <w:spacing w:before="160" w:after="60"/>
+        <w:pStyle w:val="ListBullet"/>
+        <w:spacing w:after="60" w:line="276" w:lineRule="auto"/>
       </w:pPr>
       <w:r>
         <w:rPr>
           <w:rFonts w:ascii="Calibri" w:hAnsi="Calibri"/>
           <w:b/>
-          <w:color w:val="2B4C7E"/>
-          <w:sz w:val="24"/>
+          <w:color w:val="323232"/>
+          <w:sz w:val="21"/>
         </w:rPr>
-        <w:t>Layer 1: Data Ingestion Pipeline (`ml_engine/data_pipeline/`)</w:t>
+        <w:t xml:space="preserve">Layer 4: Hybrid Machine Learning Engine: </w:t>
+      </w:r>
+      <w:r>
+        <w:rPr>
+          <w:rFonts w:ascii="Calibri" w:hAnsi="Calibri"/>
+          <w:color w:val="323232"/>
+          <w:sz w:val="21"/>
+        </w:rPr>
+        <w:t>Two-tier forecasting architecture combining LightGBM (1-15 day non-linear volatility) with Facebook Prophet (16-60 day quarterly seasonal trend) and 80% statistical confidence bands.</w:t>
       </w:r>
     </w:p>
     <w:p>
       <w:pPr>
         <w:pStyle w:val="ListBullet"/>
-        <w:spacing w:before="20" w:after="20"/>
-        <w:ind w:left="360"/>
+        <w:spacing w:after="60" w:line="276" w:lineRule="auto"/>
       </w:pPr>
       <w:r>
         <w:rPr>
           <w:rFonts w:ascii="Calibri" w:hAnsi="Calibri"/>
           <w:b/>
-          <w:color w:val="111827"/>
+          <w:color w:val="323232"/>
           <w:sz w:val="21"/>
         </w:rPr>
-        <w:t>Public &amp; Macro Feeds</w:t>
+        <w:t xml:space="preserve">Layer 5: Operations Research MILP Solver: </w:t>
       </w:r>
       <w:r>
         <w:rPr>
           <w:rFonts w:ascii="Calibri" w:hAnsi="Calibri"/>
+          <w:color w:val="323232"/>
           <w:sz w:val="21"/>
         </w:rPr>
-        <w:t>:</w:t>
+        <w:t>PuLP Branch-and-Cut CBC optimizer that minimizes Total Landed Logistics Cost (Voyage Freight + Demurrage Penalties) while strictly enforcing channel draft limits and berth constraints.</w:t>
       </w:r>
     </w:p>
     <w:p>
       <w:pPr>
         <w:pStyle w:val="ListBullet"/>
-        <w:spacing w:before="20" w:after="20"/>
-        <w:ind w:left="720"/>
+        <w:spacing w:after="60" w:line="276" w:lineRule="auto"/>
       </w:pPr>
       <w:r>
         <w:rPr>
-          <w:rFonts w:ascii="Consolas" w:hAnsi="Consolas"/>
-          <w:color w:val="1E40AF"/>
-          <w:sz w:val="19"/>
+          <w:rFonts w:ascii="Calibri" w:hAnsi="Calibri"/>
+          <w:b/>
+          <w:color w:val="323232"/>
+          <w:sz w:val="21"/>
         </w:rPr>
-        <w:t>yfinance</w:t>
+        <w:t xml:space="preserve">Layer 6: Enterprise Command Center UI: </w:t>
       </w:r>
       <w:r>
         <w:rPr>
           <w:rFonts w:ascii="Calibri" w:hAnsi="Calibri"/>
+          <w:color w:val="323232"/>
           <w:sz w:val="21"/>
         </w:rPr>
-        <w:t xml:space="preserve"> module pulls historical daily closes for global benchmarks (Brent Crude Oil </w:t>
+        <w:t>Next.js 14 App Router dashboard built in TypeScript and Tailwind CSS, providing dual-currency visualization (USD $ &amp; INR ₹ Crores) and disruption stress-testing controls.</w:t>
       </w:r>
-      <w:r>
-        <w:rPr>
-          <w:rFonts w:ascii="Consolas" w:hAnsi="Consolas"/>
-          <w:color w:val="1E40AF"/>
-          <w:sz w:val="19"/>
-        </w:rPr>
-        <w:t>BZ=F</w:t>
-      </w:r>
+    </w:p>
+    <w:p>
+      <w:pPr>
+        <w:keepNext/>
+        <w:spacing w:before="320" w:after="120"/>
+      </w:pPr>
       <w:r>
         <w:rPr>
           <w:rFonts w:ascii="Calibri" w:hAnsi="Calibri"/>
-          <w:sz w:val="21"/>
+          <w:b/>
+          <w:color w:val="003366"/>
+          <w:sz w:val="32"/>
         </w:rPr>
-        <w:t xml:space="preserve">, USD/INR currency exchange </w:t>
+        <w:t>2. Detailed Layer Specifications</w:t>
       </w:r>
-      <w:r>
-        <w:rPr>
-          <w:rFonts w:ascii="Consolas" w:hAnsi="Consolas"/>
-          <w:color w:val="1E40AF"/>
-          <w:sz w:val="19"/>
-        </w:rPr>
-        <w:t>INR=X</w:t>
-      </w:r>
+    </w:p>
+    <w:p>
+      <w:pPr>
+        <w:keepNext/>
+        <w:spacing w:before="240" w:after="80"/>
+      </w:pPr>
       <w:r>
         <w:rPr>
           <w:rFonts w:ascii="Calibri" w:hAnsi="Calibri"/>
-          <w:sz w:val="21"/>
+          <w:b/>
+          <w:color w:val="1E5A96"/>
+          <w:sz w:val="26"/>
         </w:rPr>
-        <w:t>, and Baltic proxy equities).</w:t>
+        <w:t>Layer 1: Data Ingestion Pipeline (ml_engine/data_pipeline/)</w:t>
       </w:r>
     </w:p>
     <w:p>
       <w:pPr>
         <w:pStyle w:val="ListBullet"/>
-        <w:spacing w:before="20" w:after="20"/>
-        <w:ind w:left="720"/>
+        <w:spacing w:after="60" w:line="276" w:lineRule="auto"/>
       </w:pPr>
       <w:r>
         <w:rPr>
           <w:rFonts w:ascii="Calibri" w:hAnsi="Calibri"/>
+          <w:b/>
+          <w:color w:val="323232"/>
           <w:sz w:val="21"/>
         </w:rPr>
-        <w:t>Multi-variate geometric random walk and volatility-drift generator synthesizes official Baltic Exchange indices:</w:t>
+        <w:t xml:space="preserve">Kaggle 25-Year Dataset: </w:t>
+      </w:r>
+      <w:r>
+        <w:rPr>
+          <w:rFonts w:ascii="Calibri" w:hAnsi="Calibri"/>
+          <w:color w:val="323232"/>
+          <w:sz w:val="21"/>
+        </w:rPr>
+        <w:t>ml_engine/data_pipeline/raw_data/shipping_rates.csv contains 300 monthly records from 2000 to 2024 detailing Baltic Dry Index, container spot rates, and supply chain pressure.</w:t>
       </w:r>
     </w:p>
     <w:p>
       <w:pPr>
         <w:pStyle w:val="ListBullet"/>
-        <w:spacing w:before="20" w:after="20"/>
-        <w:ind w:left="1080"/>
+        <w:spacing w:after="60" w:line="276" w:lineRule="auto"/>
       </w:pPr>
       <w:r>
         <w:rPr>
           <w:rFonts w:ascii="Calibri" w:hAnsi="Calibri"/>
           <w:b/>
-          <w:color w:val="111827"/>
+          <w:color w:val="323232"/>
           <w:sz w:val="21"/>
         </w:rPr>
-        <w:t>BCI</w:t>
+        <w:t xml:space="preserve">Historical Disruption Events: </w:t>
       </w:r>
       <w:r>
         <w:rPr>
           <w:rFonts w:ascii="Calibri" w:hAnsi="Calibri"/>
+          <w:color w:val="323232"/>
           <w:sz w:val="21"/>
         </w:rPr>
-        <w:t xml:space="preserve"> (Baltic Capesize Index - 150,000+ DWT, iron ore &amp; coking coal)</w:t>
+        <w:t>ml_engine/data_pipeline/raw_data/disruption_events.csv calibrates model shocks against historical events including the 2021 Suez blockage, Red Sea missile attacks, COVID-19 lockdowns, and Panama canal droughts.</w:t>
       </w:r>
     </w:p>
     <w:p>
       <w:pPr>
         <w:pStyle w:val="ListBullet"/>
-        <w:spacing w:before="20" w:after="20"/>
-        <w:ind w:left="1080"/>
+        <w:spacing w:after="60" w:line="276" w:lineRule="auto"/>
       </w:pPr>
       <w:r>
         <w:rPr>
           <w:rFonts w:ascii="Calibri" w:hAnsi="Calibri"/>
           <w:b/>
-          <w:color w:val="111827"/>
+          <w:color w:val="323232"/>
           <w:sz w:val="21"/>
         </w:rPr>
-        <w:t>BPI</w:t>
+        <w:t xml:space="preserve">Live Macroeconomic Feeds: </w:t>
       </w:r>
       <w:r>
         <w:rPr>
           <w:rFonts w:ascii="Calibri" w:hAnsi="Calibri"/>
+          <w:color w:val="323232"/>
           <w:sz w:val="21"/>
         </w:rPr>
-        <w:t xml:space="preserve"> (Baltic Panamax Index - 70,000–90,000 DWT, coking coal)</w:t>
+        <w:t>Pulls real-time daily closes for Brent Crude Oil (BZ=F) to track marine bunker fuel price covariance and USD/INR exchange rates (USDINR=X).</w:t>
       </w:r>
     </w:p>
     <w:p>
       <w:pPr>
         <w:pStyle w:val="ListBullet"/>
-        <w:spacing w:before="20" w:after="20"/>
-        <w:ind w:left="1080"/>
+        <w:spacing w:after="60" w:line="276" w:lineRule="auto"/>
       </w:pPr>
       <w:r>
         <w:rPr>
           <w:rFonts w:ascii="Calibri" w:hAnsi="Calibri"/>
           <w:b/>
-          <w:color w:val="111827"/>
+          <w:color w:val="323232"/>
           <w:sz w:val="21"/>
         </w:rPr>
-        <w:t>BSI</w:t>
+        <w:t xml:space="preserve">Database Seeding Automation: </w:t>
       </w:r>
       <w:r>
         <w:rPr>
           <w:rFonts w:ascii="Calibri" w:hAnsi="Calibri"/>
+          <w:color w:val="323232"/>
           <w:sz w:val="21"/>
         </w:rPr>
-        <w:t xml:space="preserve"> (Baltic Supramax Index - 50,000–65,000 DWT, geared shallow bulkers)</w:t>
+        <w:t>python ml_engine/data_pipeline/seed_database.py runs an automated bulk ETL pipeline ingesting ~1,316 market telemetry points and 6 active port profiles into the database.</w:t>
+      </w:r>
+    </w:p>
+    <w:p>
+      <w:pPr>
+        <w:keepNext/>
+        <w:spacing w:before="240" w:after="80"/>
+      </w:pPr>
+      <w:r>
+        <w:rPr>
+          <w:rFonts w:ascii="Calibri" w:hAnsi="Calibri"/>
+          <w:b/>
+          <w:color w:val="1E5A96"/>
+          <w:sz w:val="26"/>
+        </w:rPr>
+        <w:t>Layer 2: Storage &amp; Database Architecture (backend/models/)</w:t>
+      </w:r>
+    </w:p>
+    <w:p>
+      <w:pPr>
+        <w:spacing w:after="80" w:line="276" w:lineRule="auto"/>
+      </w:pPr>
+      <w:r>
+        <w:rPr>
+          <w:rFonts w:ascii="Calibri" w:hAnsi="Calibri"/>
+          <w:color w:val="323232"/>
+          <w:sz w:val="21"/>
+        </w:rPr>
+        <w:t>Built on PostgreSQL with robust time-series indexing and ACID transaction support. Configured with connection pooling (pool_pre_ping=True) to withstand cloud sleep cycles on free-tier services.</w:t>
+      </w:r>
+    </w:p>
+    <w:tbl>
+      <w:tblPr>
+        <w:tblW w:type="auto" w:w="0"/>
+        <w:jc w:val="center"/>
+        <w:tblLayout w:type="fixed"/>
+        <w:tblLook w:firstColumn="1" w:firstRow="1" w:lastColumn="0" w:lastRow="0" w:noHBand="0" w:noVBand="1" w:val="04A0"/>
+      </w:tblPr>
+      <w:tblGrid>
+        <w:gridCol w:w="3120"/>
+        <w:gridCol w:w="3120"/>
+        <w:gridCol w:w="3120"/>
+      </w:tblGrid>
+      <w:tr>
+        <w:tc>
+          <w:tcPr>
+            <w:tcW w:type="dxa" w:w="3120"/>
+            <w:shd w:fill="003366"/>
+            <w:tcMar>
+              <w:top w:w="100" w:type="dxa"/>
+              <w:bottom w:w="100" w:type="dxa"/>
+              <w:left w:w="100" w:type="dxa"/>
+              <w:right w:w="100" w:type="dxa"/>
+            </w:tcMar>
+          </w:tcPr>
+          <w:p>
+            <w:r>
+              <w:rPr>
+                <w:rFonts w:ascii="Calibri" w:hAnsi="Calibri"/>
+                <w:b/>
+                <w:color w:val="FFFFFF"/>
+                <w:sz w:val="19"/>
+              </w:rPr>
+              <w:t>Table Name</w:t>
+            </w:r>
+          </w:p>
+        </w:tc>
+        <w:tc>
+          <w:tcPr>
+            <w:tcW w:type="dxa" w:w="3120"/>
+            <w:shd w:fill="003366"/>
+            <w:tcMar>
+              <w:top w:w="100" w:type="dxa"/>
+              <w:bottom w:w="100" w:type="dxa"/>
+              <w:left w:w="100" w:type="dxa"/>
+              <w:right w:w="100" w:type="dxa"/>
+            </w:tcMar>
+          </w:tcPr>
+          <w:p>
+            <w:r>
+              <w:rPr>
+                <w:rFonts w:ascii="Calibri" w:hAnsi="Calibri"/>
+                <w:b/>
+                <w:color w:val="FFFFFF"/>
+                <w:sz w:val="19"/>
+              </w:rPr>
+              <w:t>Primary Columns &amp; Data Types</w:t>
+            </w:r>
+          </w:p>
+        </w:tc>
+        <w:tc>
+          <w:tcPr>
+            <w:tcW w:type="dxa" w:w="3120"/>
+            <w:shd w:fill="003366"/>
+            <w:tcMar>
+              <w:top w:w="100" w:type="dxa"/>
+              <w:bottom w:w="100" w:type="dxa"/>
+              <w:left w:w="100" w:type="dxa"/>
+              <w:right w:w="100" w:type="dxa"/>
+            </w:tcMar>
+          </w:tcPr>
+          <w:p>
+            <w:r>
+              <w:rPr>
+                <w:rFonts w:ascii="Calibri" w:hAnsi="Calibri"/>
+                <w:b/>
+                <w:color w:val="FFFFFF"/>
+                <w:sz w:val="19"/>
+              </w:rPr>
+              <w:t>Business Purpose</w:t>
+            </w:r>
+          </w:p>
+        </w:tc>
+      </w:tr>
+      <w:tr>
+        <w:tc>
+          <w:tcPr>
+            <w:tcW w:type="dxa" w:w="3120"/>
+            <w:shd w:fill="FFFFFF"/>
+            <w:tcMar>
+              <w:top w:w="80" w:type="dxa"/>
+              <w:bottom w:w="80" w:type="dxa"/>
+              <w:left w:w="100" w:type="dxa"/>
+              <w:right w:w="100" w:type="dxa"/>
+            </w:tcMar>
+          </w:tcPr>
+          <w:p>
+            <w:r>
+              <w:rPr>
+                <w:rFonts w:ascii="Calibri" w:hAnsi="Calibri"/>
+                <w:color w:val="323232"/>
+                <w:sz w:val="18"/>
+              </w:rPr>
+              <w:t>market_data</w:t>
+            </w:r>
+          </w:p>
+        </w:tc>
+        <w:tc>
+          <w:tcPr>
+            <w:tcW w:type="dxa" w:w="3120"/>
+            <w:shd w:fill="FFFFFF"/>
+            <w:tcMar>
+              <w:top w:w="80" w:type="dxa"/>
+              <w:bottom w:w="80" w:type="dxa"/>
+              <w:left w:w="100" w:type="dxa"/>
+              <w:right w:w="100" w:type="dxa"/>
+            </w:tcMar>
+          </w:tcPr>
+          <w:p>
+            <w:r>
+              <w:rPr>
+                <w:rFonts w:ascii="Calibri" w:hAnsi="Calibri"/>
+                <w:color w:val="323232"/>
+                <w:sz w:val="18"/>
+              </w:rPr>
+              <w:t>id (PK), index_name (VARCHAR), value (FLOAT), timestamp (DATETIME), currency (VARCHAR)</w:t>
+            </w:r>
+          </w:p>
+        </w:tc>
+        <w:tc>
+          <w:tcPr>
+            <w:tcW w:type="dxa" w:w="3120"/>
+            <w:shd w:fill="FFFFFF"/>
+            <w:tcMar>
+              <w:top w:w="80" w:type="dxa"/>
+              <w:bottom w:w="80" w:type="dxa"/>
+              <w:left w:w="100" w:type="dxa"/>
+              <w:right w:w="100" w:type="dxa"/>
+            </w:tcMar>
+          </w:tcPr>
+          <w:p>
+            <w:r>
+              <w:rPr>
+                <w:rFonts w:ascii="Calibri" w:hAnsi="Calibri"/>
+                <w:color w:val="323232"/>
+                <w:sz w:val="18"/>
+              </w:rPr>
+              <w:t>Stores 25 years of daily/monthly historical rates for BCI, BPI, BSI, BRENT_CRUDE, and USD_INR.</w:t>
+            </w:r>
+          </w:p>
+        </w:tc>
+      </w:tr>
+      <w:tr>
+        <w:tc>
+          <w:tcPr>
+            <w:tcW w:type="dxa" w:w="3120"/>
+            <w:shd w:fill="F9FBFD"/>
+            <w:tcMar>
+              <w:top w:w="80" w:type="dxa"/>
+              <w:bottom w:w="80" w:type="dxa"/>
+              <w:left w:w="100" w:type="dxa"/>
+              <w:right w:w="100" w:type="dxa"/>
+            </w:tcMar>
+          </w:tcPr>
+          <w:p>
+            <w:r>
+              <w:rPr>
+                <w:rFonts w:ascii="Calibri" w:hAnsi="Calibri"/>
+                <w:color w:val="323232"/>
+                <w:sz w:val="18"/>
+              </w:rPr>
+              <w:t>port_data</w:t>
+            </w:r>
+          </w:p>
+        </w:tc>
+        <w:tc>
+          <w:tcPr>
+            <w:tcW w:type="dxa" w:w="3120"/>
+            <w:shd w:fill="F9FBFD"/>
+            <w:tcMar>
+              <w:top w:w="80" w:type="dxa"/>
+              <w:bottom w:w="80" w:type="dxa"/>
+              <w:left w:w="100" w:type="dxa"/>
+              <w:right w:w="100" w:type="dxa"/>
+            </w:tcMar>
+          </w:tcPr>
+          <w:p>
+            <w:r>
+              <w:rPr>
+                <w:rFonts w:ascii="Calibri" w:hAnsi="Calibri"/>
+                <w:color w:val="323232"/>
+                <w:sz w:val="18"/>
+              </w:rPr>
+              <w:t>id (PK), port_name (VARCHAR), max_draft_meters (FLOAT), current_waiting_time_hours (FLOAT), berth_count (INT)</w:t>
+            </w:r>
+          </w:p>
+        </w:tc>
+        <w:tc>
+          <w:tcPr>
+            <w:tcW w:type="dxa" w:w="3120"/>
+            <w:shd w:fill="F9FBFD"/>
+            <w:tcMar>
+              <w:top w:w="80" w:type="dxa"/>
+              <w:bottom w:w="80" w:type="dxa"/>
+              <w:left w:w="100" w:type="dxa"/>
+              <w:right w:w="100" w:type="dxa"/>
+            </w:tcMar>
+          </w:tcPr>
+          <w:p>
+            <w:r>
+              <w:rPr>
+                <w:rFonts w:ascii="Calibri" w:hAnsi="Calibri"/>
+                <w:color w:val="323232"/>
+                <w:sz w:val="18"/>
+              </w:rPr>
+              <w:t>Stores real-time navigational channel depth, waiting delays, and handling throughput for Indian ports.</w:t>
+            </w:r>
+          </w:p>
+        </w:tc>
+      </w:tr>
+      <w:tr>
+        <w:tc>
+          <w:tcPr>
+            <w:tcW w:type="dxa" w:w="3120"/>
+            <w:shd w:fill="FFFFFF"/>
+            <w:tcMar>
+              <w:top w:w="80" w:type="dxa"/>
+              <w:bottom w:w="80" w:type="dxa"/>
+              <w:left w:w="100" w:type="dxa"/>
+              <w:right w:w="100" w:type="dxa"/>
+            </w:tcMar>
+          </w:tcPr>
+          <w:p>
+            <w:r>
+              <w:rPr>
+                <w:rFonts w:ascii="Calibri" w:hAnsi="Calibri"/>
+                <w:color w:val="323232"/>
+                <w:sz w:val="18"/>
+              </w:rPr>
+              <w:t>optimization_logs</w:t>
+            </w:r>
+          </w:p>
+        </w:tc>
+        <w:tc>
+          <w:tcPr>
+            <w:tcW w:type="dxa" w:w="3120"/>
+            <w:shd w:fill="FFFFFF"/>
+            <w:tcMar>
+              <w:top w:w="80" w:type="dxa"/>
+              <w:bottom w:w="80" w:type="dxa"/>
+              <w:left w:w="100" w:type="dxa"/>
+              <w:right w:w="100" w:type="dxa"/>
+            </w:tcMar>
+          </w:tcPr>
+          <w:p>
+            <w:r>
+              <w:rPr>
+                <w:rFonts w:ascii="Calibri" w:hAnsi="Calibri"/>
+                <w:color w:val="323232"/>
+                <w:sz w:val="18"/>
+              </w:rPr>
+              <w:t>id (PK), target_port (VARCHAR), required_cargo_mt (FLOAT), total_cost_usd (FLOAT), vessel_schedule (JSONB)</w:t>
+            </w:r>
+          </w:p>
+        </w:tc>
+        <w:tc>
+          <w:tcPr>
+            <w:tcW w:type="dxa" w:w="3120"/>
+            <w:shd w:fill="FFFFFF"/>
+            <w:tcMar>
+              <w:top w:w="80" w:type="dxa"/>
+              <w:bottom w:w="80" w:type="dxa"/>
+              <w:left w:w="100" w:type="dxa"/>
+              <w:right w:w="100" w:type="dxa"/>
+            </w:tcMar>
+          </w:tcPr>
+          <w:p>
+            <w:r>
+              <w:rPr>
+                <w:rFonts w:ascii="Calibri" w:hAnsi="Calibri"/>
+                <w:color w:val="323232"/>
+                <w:sz w:val="18"/>
+              </w:rPr>
+              <w:t>Audit trail storing every optimization run, input constraints, solver duration, and scheduled vessel dispatches.</w:t>
+            </w:r>
+          </w:p>
+        </w:tc>
+      </w:tr>
+    </w:tbl>
+    <w:p>
+      <w:pPr>
+        <w:spacing w:after="80" w:line="276" w:lineRule="auto"/>
+      </w:pPr>
+      <w:r>
+        <w:rPr>
+          <w:rFonts w:ascii="Calibri" w:hAnsi="Calibri"/>
+          <w:color w:val="323232"/>
+          <w:sz w:val="21"/>
+        </w:rPr>
+      </w:r>
+    </w:p>
+    <w:p>
+      <w:pPr>
+        <w:keepNext/>
+        <w:spacing w:before="240" w:after="80"/>
+      </w:pPr>
+      <w:r>
+        <w:rPr>
+          <w:rFonts w:ascii="Calibri" w:hAnsi="Calibri"/>
+          <w:b/>
+          <w:color w:val="1E5A96"/>
+          <w:sz w:val="26"/>
+        </w:rPr>
+        <w:t>Layer 3: FastAPI Asynchronous Backend Services (backend/routers/)</w:t>
+      </w:r>
+    </w:p>
+    <w:p>
+      <w:pPr>
+        <w:spacing w:after="80" w:line="276" w:lineRule="auto"/>
+      </w:pPr>
+      <w:r>
+        <w:rPr>
+          <w:rFonts w:ascii="Calibri" w:hAnsi="Calibri"/>
+          <w:color w:val="323232"/>
+          <w:sz w:val="21"/>
+        </w:rPr>
+        <w:t>The backend is implemented in Python 3.11 using FastAPI and Uvicorn. Key architectural patterns include:</w:t>
       </w:r>
     </w:p>
     <w:p>
       <w:pPr>
         <w:pStyle w:val="ListBullet"/>
-        <w:spacing w:before="20" w:after="20"/>
-        <w:ind w:left="1080"/>
+        <w:spacing w:after="60" w:line="276" w:lineRule="auto"/>
       </w:pPr>
       <w:r>
         <w:rPr>
           <w:rFonts w:ascii="Calibri" w:hAnsi="Calibri"/>
           <w:b/>
-          <w:color w:val="111827"/>
+          <w:color w:val="323232"/>
           <w:sz w:val="21"/>
         </w:rPr>
-        <w:t>BUNKER_SIN</w:t>
+        <w:t xml:space="preserve">Bulletproof CORS: </w:t>
       </w:r>
       <w:r>
         <w:rPr>
           <w:rFonts w:ascii="Calibri" w:hAnsi="Calibri"/>
+          <w:color w:val="323232"/>
           <w:sz w:val="21"/>
         </w:rPr>
-        <w:t xml:space="preserve"> (Singapore Very Low Sulfur Fuel Oil - $/MT)</w:t>
+        <w:t>Dynamic CORS middleware configured to accept cross-origin requests from any verified Vercel preview or production domain without throwing 400 Bad Request on OPTIONS preflight.</w:t>
       </w:r>
     </w:p>
     <w:p>
       <w:pPr>
         <w:pStyle w:val="ListBullet"/>
-        <w:spacing w:before="20" w:after="20"/>
-        <w:ind w:left="360"/>
+        <w:spacing w:after="60" w:line="276" w:lineRule="auto"/>
       </w:pPr>
       <w:r>
         <w:rPr>
           <w:rFonts w:ascii="Calibri" w:hAnsi="Calibri"/>
           <w:b/>
-          <w:color w:val="111827"/>
+          <w:color w:val="323232"/>
           <w:sz w:val="21"/>
         </w:rPr>
-        <w:t>Indian Port Telemetry Generator</w:t>
+        <w:t xml:space="preserve">Dynamic Port Routing: </w:t>
       </w:r>
       <w:r>
         <w:rPr>
           <w:rFonts w:ascii="Calibri" w:hAnsi="Calibri"/>
+          <w:color w:val="323232"/>
           <w:sz w:val="21"/>
         </w:rPr>
-        <w:t>:</w:t>
+        <w:t>Internal ML engine service calls dynamically bind to Render's internal PORT environment variable (default 10000 on Render, 8000 on local) using 127.0.0.1 to avoid IPv6 resolution delays.</w:t>
       </w:r>
     </w:p>
     <w:p>
       <w:pPr>
         <w:pStyle w:val="ListBullet"/>
-        <w:spacing w:before="20" w:after="20"/>
-        <w:ind w:left="720"/>
+        <w:spacing w:after="60" w:line="276" w:lineRule="auto"/>
       </w:pPr>
       <w:r>
         <w:rPr>
           <w:rFonts w:ascii="Calibri" w:hAnsi="Calibri"/>
+          <w:b/>
+          <w:color w:val="323232"/>
           <w:sz w:val="21"/>
         </w:rPr>
-        <w:t>Simulates dynamic draft allowances, tidal restrictions, berth counts, and congestion delays across major steel discharge hubs:</w:t>
+        <w:t xml:space="preserve">RESTful Endpoints: </w:t>
+      </w:r>
+      <w:r>
+        <w:rPr>
+          <w:rFonts w:ascii="Calibri" w:hAnsi="Calibri"/>
+          <w:color w:val="323232"/>
+          <w:sz w:val="21"/>
+        </w:rPr>
+        <w:t>Router structure: /api/v1/health (readiness), /api/v1/market-data (time-series), /api/v1/port-data (telemetry), /api/v1/forecasts (ML predictions), /api/v1/optimize (MILP solver), /api/v1/disruptions (scenarios).</w:t>
+      </w:r>
+    </w:p>
+    <w:p>
+      <w:pPr>
+        <w:keepNext/>
+        <w:spacing w:before="240" w:after="80"/>
+      </w:pPr>
+      <w:r>
+        <w:rPr>
+          <w:rFonts w:ascii="Calibri" w:hAnsi="Calibri"/>
+          <w:b/>
+          <w:color w:val="1E5A96"/>
+          <w:sz w:val="26"/>
+        </w:rPr>
+        <w:t>Layer 4: Hybrid Machine Learning Engine (ml_engine/forecasting/)</w:t>
+      </w:r>
+    </w:p>
+    <w:p>
+      <w:pPr>
+        <w:spacing w:after="80" w:line="276" w:lineRule="auto"/>
+      </w:pPr>
+      <w:r>
+        <w:rPr>
+          <w:rFonts w:ascii="Calibri" w:hAnsi="Calibri"/>
+          <w:color w:val="323232"/>
+          <w:sz w:val="21"/>
+        </w:rPr>
+        <w:t>Designed to overcome the limitations of naive single-model forecasting:</w:t>
       </w:r>
     </w:p>
     <w:p>
       <w:pPr>
         <w:pStyle w:val="ListBullet"/>
-        <w:spacing w:before="20" w:after="20"/>
-        <w:ind w:left="1080"/>
+        <w:spacing w:after="60" w:line="276" w:lineRule="auto"/>
       </w:pPr>
       <w:r>
         <w:rPr>
           <w:rFonts w:ascii="Calibri" w:hAnsi="Calibri"/>
           <w:b/>
-          <w:color w:val="111827"/>
+          <w:color w:val="323232"/>
           <w:sz w:val="21"/>
         </w:rPr>
-        <w:t>Paradip</w:t>
+        <w:t xml:space="preserve">Short-Horizon (Days 1–15 - LightGBM): </w:t>
       </w:r>
       <w:r>
         <w:rPr>
           <w:rFonts w:ascii="Calibri" w:hAnsi="Calibri"/>
+          <w:color w:val="323232"/>
           <w:sz w:val="21"/>
         </w:rPr>
-        <w:t xml:space="preserve"> (14.5m Max Draft, 36h avg queue)</w:t>
+        <w:t>Multi-lag gradient boosted decision trees. Engineered features: 1-day, 2-day, 3-day, 7-day, 14-day, 21-day, 30-day lag values; 7-day, 14-day, 30-day rolling means; rolling standard deviation (volatility); and day-of-week seasonality.</w:t>
       </w:r>
     </w:p>
     <w:p>
       <w:pPr>
         <w:pStyle w:val="ListBullet"/>
-        <w:spacing w:before="20" w:after="20"/>
-        <w:ind w:left="1080"/>
+        <w:spacing w:after="60" w:line="276" w:lineRule="auto"/>
       </w:pPr>
       <w:r>
         <w:rPr>
           <w:rFonts w:ascii="Calibri" w:hAnsi="Calibri"/>
           <w:b/>
-          <w:color w:val="111827"/>
+          <w:color w:val="323232"/>
           <w:sz w:val="21"/>
         </w:rPr>
-        <w:t>Visakhapatnam</w:t>
+        <w:t xml:space="preserve">Medium-Horizon (Days 16–60 - Prophet): </w:t>
       </w:r>
       <w:r>
         <w:rPr>
           <w:rFonts w:ascii="Calibri" w:hAnsi="Calibri"/>
+          <w:color w:val="323232"/>
           <w:sz w:val="21"/>
         </w:rPr>
-        <w:t xml:space="preserve"> (16.5m Max Draft, 28h avg queue)</w:t>
+        <w:t>Decomposed additive seasonal model with yearly and monthly seasonality, baseline-scaled to 25 years of real Kaggle BDI data. Dates are converted to timezone-naive datetimes (.dt.tz_localize(None)) to prevent runtime crashes.</w:t>
       </w:r>
     </w:p>
     <w:p>
       <w:pPr>
         <w:pStyle w:val="ListBullet"/>
-        <w:spacing w:before="20" w:after="20"/>
-        <w:ind w:left="1080"/>
+        <w:spacing w:after="60" w:line="276" w:lineRule="auto"/>
       </w:pPr>
       <w:r>
         <w:rPr>
           <w:rFonts w:ascii="Calibri" w:hAnsi="Calibri"/>
           <w:b/>
-          <w:color w:val="111827"/>
+          <w:color w:val="323232"/>
           <w:sz w:val="21"/>
         </w:rPr>
-        <w:t>Haldia</w:t>
+        <w:t xml:space="preserve">80% Statistical Confidence Envelope: </w:t>
       </w:r>
       <w:r>
         <w:rPr>
           <w:rFonts w:ascii="Calibri" w:hAnsi="Calibri"/>
+          <w:color w:val="323232"/>
           <w:sz w:val="21"/>
         </w:rPr>
-        <w:t xml:space="preserve"> (12.0m Max Draft riverine channel, 44h avg queue)</w:t>
+        <w:t>Evaluates residual standard error to compute an 80% confidence interval band: [y_hat - 1.28 * sigma, y_hat + 1.28 * sigma].</w:t>
       </w:r>
     </w:p>
     <w:p>
       <w:pPr>
         <w:pStyle w:val="ListBullet"/>
-        <w:spacing w:before="20" w:after="20"/>
-        <w:ind w:left="1080"/>
+        <w:spacing w:after="60" w:line="276" w:lineRule="auto"/>
       </w:pPr>
       <w:r>
         <w:rPr>
           <w:rFonts w:ascii="Calibri" w:hAnsi="Calibri"/>
           <w:b/>
-          <w:color w:val="111827"/>
+          <w:color w:val="323232"/>
           <w:sz w:val="21"/>
         </w:rPr>
-        <w:t>Dhamra</w:t>
+        <w:t xml:space="preserve">Hybrid Blending Bridge: </w:t>
       </w:r>
       <w:r>
         <w:rPr>
           <w:rFonts w:ascii="Calibri" w:hAnsi="Calibri"/>
+          <w:color w:val="323232"/>
           <w:sz w:val="21"/>
         </w:rPr>
-        <w:t xml:space="preserve"> (18.0m Deepwater berth, 18h avg queue)</w:t>
+        <w:t>Implements an exponential decay offset bridge between Day 14 and Day 25 to guarantee smooth, continuous trajectory transitions.</w:t>
+      </w:r>
+    </w:p>
+    <w:p>
+      <w:pPr>
+        <w:keepNext/>
+        <w:spacing w:before="240" w:after="80"/>
+      </w:pPr>
+      <w:r>
+        <w:rPr>
+          <w:rFonts w:ascii="Calibri" w:hAnsi="Calibri"/>
+          <w:b/>
+          <w:color w:val="1E5A96"/>
+          <w:sz w:val="26"/>
+        </w:rPr>
+        <w:t>Layer 5: Operations Research MILP Optimization Engine (ml_engine/optimization/)</w:t>
+      </w:r>
+    </w:p>
+    <w:p>
+      <w:pPr>
+        <w:spacing w:after="80" w:line="276" w:lineRule="auto"/>
+      </w:pPr>
+      <w:r>
+        <w:rPr>
+          <w:rFonts w:ascii="Calibri" w:hAnsi="Calibri"/>
+          <w:color w:val="323232"/>
+          <w:sz w:val="21"/>
+        </w:rPr>
+        <w:t>Formulates vessel fleet chartering as a Mixed-Integer Linear Program (MILP) solved via PuLP's COIN-OR CBC Branch-and-Cut algorithm.</w:t>
+      </w:r>
+    </w:p>
+    <w:p>
+      <w:pPr>
+        <w:keepNext/>
+        <w:spacing w:before="160" w:after="40"/>
+      </w:pPr>
+      <w:r>
+        <w:rPr>
+          <w:rFonts w:ascii="Calibri" w:hAnsi="Calibri"/>
+          <w:b/>
+          <w:color w:val="323232"/>
+          <w:sz w:val="22"/>
+        </w:rPr>
+        <w:t>Mathematical Formulation:</w:t>
+      </w:r>
+    </w:p>
+    <w:p>
+      <w:pPr>
+        <w:spacing w:after="80" w:line="276" w:lineRule="auto"/>
+      </w:pPr>
+      <w:r>
+        <w:rPr>
+          <w:rFonts w:ascii="Calibri" w:hAnsi="Calibri"/>
+          <w:color w:val="323232"/>
+          <w:sz w:val="21"/>
+        </w:rPr>
+        <w:t>1. Sets &amp; Indices: t in {1..H} (Planning days), v in {Capesize, Panamax, Supramax}, p in Ports, m in Origins (Australia, Indonesia).</w:t>
+      </w:r>
+    </w:p>
+    <w:p>
+      <w:pPr>
+        <w:spacing w:after="80" w:line="276" w:lineRule="auto"/>
+      </w:pPr>
+      <w:r>
+        <w:rPr>
+          <w:rFonts w:ascii="Calibri" w:hAnsi="Calibri"/>
+          <w:color w:val="323232"/>
+          <w:sz w:val="21"/>
+        </w:rPr>
+        <w:t>2. Parameters: D_required (Total MT demand), C_v (Vessel capacity MT), F_v,t (Forecasted rate $/MT), R_m (Route distance multiplier: 1.0 Aus, 0.85 Indo), K_demurrage ($25,000/day), W_p (Port delay days), d_v (Vessel draft m), Draft_max_p (Port channel depth m), B_max_p,t (Berth throughput).</w:t>
+      </w:r>
+    </w:p>
+    <w:p>
+      <w:pPr>
+        <w:spacing w:after="80" w:line="276" w:lineRule="auto"/>
+      </w:pPr>
+      <w:r>
+        <w:rPr>
+          <w:rFonts w:ascii="Calibri" w:hAnsi="Calibri"/>
+          <w:color w:val="323232"/>
+          <w:sz w:val="21"/>
+        </w:rPr>
+        <w:t>3. Decision Variables: x_v,t in {0, 1, 2, ...} (Integer number of ships chartered).</w:t>
+      </w:r>
+    </w:p>
+    <w:p>
+      <w:pPr>
+        <w:spacing w:after="80" w:line="276" w:lineRule="auto"/>
+      </w:pPr>
+      <w:r>
+        <w:rPr>
+          <w:rFonts w:ascii="Calibri" w:hAnsi="Calibri"/>
+          <w:color w:val="323232"/>
+          <w:sz w:val="21"/>
+        </w:rPr>
+        <w:t>4. Objective Function: Minimize Total Landed Cost (Voyage Freight + Demurrage):</w:t>
+      </w:r>
+    </w:p>
+    <w:p>
+      <w:pPr>
+        <w:spacing w:after="80" w:line="276" w:lineRule="auto"/>
+      </w:pPr>
+      <w:r>
+        <w:rPr>
+          <w:rFonts w:ascii="Calibri" w:hAnsi="Calibri"/>
+          <w:b/>
+          <w:color w:val="323232"/>
+          <w:sz w:val="21"/>
+        </w:rPr>
+        <w:t xml:space="preserve">Objective: </w:t>
+      </w:r>
+      <w:r>
+        <w:rPr>
+          <w:rFonts w:ascii="Calibri" w:hAnsi="Calibri"/>
+          <w:color w:val="323232"/>
+          <w:sz w:val="21"/>
+        </w:rPr>
+        <w:t>min Z = sum_t sum_v [ (F_v,t * C_v * R_m) * x_v,t  +  (K_demurrage * W_p) * x_v,t ]</w:t>
+      </w:r>
+    </w:p>
+    <w:p>
+      <w:pPr>
+        <w:spacing w:after="80" w:line="276" w:lineRule="auto"/>
+      </w:pPr>
+      <w:r>
+        <w:rPr>
+          <w:rFonts w:ascii="Calibri" w:hAnsi="Calibri"/>
+          <w:color w:val="323232"/>
+          <w:sz w:val="21"/>
+        </w:rPr>
+        <w:t>5. Hard Constraints:</w:t>
       </w:r>
     </w:p>
     <w:p>
       <w:pPr>
         <w:pStyle w:val="ListBullet"/>
-        <w:spacing w:before="20" w:after="20"/>
-        <w:ind w:left="1080"/>
+        <w:spacing w:after="60" w:line="276" w:lineRule="auto"/>
       </w:pPr>
       <w:r>
         <w:rPr>
           <w:rFonts w:ascii="Calibri" w:hAnsi="Calibri"/>
           <w:b/>
-          <w:color w:val="111827"/>
+          <w:color w:val="323232"/>
           <w:sz w:val="21"/>
         </w:rPr>
-        <w:t>Gangavaram</w:t>
+        <w:t xml:space="preserve">Demand Satisfaction: </w:t>
       </w:r>
       <w:r>
         <w:rPr>
           <w:rFonts w:ascii="Calibri" w:hAnsi="Calibri"/>
+          <w:color w:val="323232"/>
           <w:sz w:val="21"/>
         </w:rPr>
-        <w:t xml:space="preserve"> (20.0m Ultra-deepwater, 12h avg queue)</w:t>
+        <w:t>sum_t sum_v (C_v * x_v,t) &gt;= D_required</w:t>
       </w:r>
     </w:p>
     <w:p>
       <w:pPr>
-        <w:spacing w:before="40" w:after="80"/>
-      </w:pPr>
-      <w:r>
-        <w:rPr>
-          <w:rFonts w:ascii="Calibri" w:hAnsi="Calibri"/>
-          <w:sz w:val="21"/>
-        </w:rPr>
-        <w:t>---</w:t>
-      </w:r>
-    </w:p>
-    <w:p>
-      <w:pPr>
-        <w:pStyle w:val="Heading3"/>
-        <w:spacing w:before="160" w:after="60"/>
+        <w:pStyle w:val="ListBullet"/>
+        <w:spacing w:after="60" w:line="276" w:lineRule="auto"/>
       </w:pPr>
       <w:r>
         <w:rPr>
           <w:rFonts w:ascii="Calibri" w:hAnsi="Calibri"/>
           <w:b/>
-          <w:color w:val="2B4C7E"/>
-          <w:sz w:val="24"/>
+          <w:color w:val="323232"/>
+          <w:sz w:val="21"/>
         </w:rPr>
-        <w:t>Layer 2: Persistence &amp; Time-Series Storage (`backend/models/`)</w:t>
+        <w:t xml:space="preserve">Port Draft Safety: </w:t>
+      </w:r>
+      <w:r>
+        <w:rPr>
+          <w:rFonts w:ascii="Calibri" w:hAnsi="Calibri"/>
+          <w:color w:val="323232"/>
+          <w:sz w:val="21"/>
+        </w:rPr>
+        <w:t>x_v,t = 0 for all v where d_v &gt; Draft_max_p  (Strict draft filter, e.g. Capesize barred from Haldia)</w:t>
       </w:r>
     </w:p>
     <w:p>
       <w:pPr>
-        <w:spacing w:before="40" w:after="80"/>
-      </w:pPr>
-      <w:r>
-        <w:rPr>
-          <w:rFonts w:ascii="Calibri" w:hAnsi="Calibri"/>
-          <w:sz w:val="21"/>
-        </w:rPr>
-        <w:t xml:space="preserve">Built on </w:t>
-      </w:r>
-      <w:r>
-        <w:rPr>
-          <w:rFonts w:ascii="Calibri" w:hAnsi="Calibri"/>
-          <w:b/>
-          <w:color w:val="111827"/>
-          <w:sz w:val="21"/>
-        </w:rPr>
-        <w:t>PostgreSQL 15</w:t>
-      </w:r>
-      <w:r>
-        <w:rPr>
-          <w:rFonts w:ascii="Calibri" w:hAnsi="Calibri"/>
-          <w:sz w:val="21"/>
-        </w:rPr>
-        <w:t xml:space="preserve"> with the </w:t>
-      </w:r>
-      <w:r>
-        <w:rPr>
-          <w:rFonts w:ascii="Calibri" w:hAnsi="Calibri"/>
-          <w:b/>
-          <w:color w:val="111827"/>
-          <w:sz w:val="21"/>
-        </w:rPr>
-        <w:t>TimescaleDB</w:t>
-      </w:r>
-      <w:r>
-        <w:rPr>
-          <w:rFonts w:ascii="Calibri" w:hAnsi="Calibri"/>
-          <w:sz w:val="21"/>
-        </w:rPr>
-        <w:t xml:space="preserve"> extension for efficient indexing and continuous aggregates of time-series maritime telemetry.</w:t>
-      </w:r>
-    </w:p>
-    <w:p>
-      <w:pPr>
-        <w:pStyle w:val="Heading4"/>
-        <w:spacing w:before="120" w:after="40"/>
+        <w:pStyle w:val="ListBullet"/>
+        <w:spacing w:after="60" w:line="276" w:lineRule="auto"/>
       </w:pPr>
       <w:r>
         <w:rPr>
           <w:rFonts w:ascii="Calibri" w:hAnsi="Calibri"/>
           <w:b/>
-          <w:color w:val="3B5988"/>
-          <w:sz w:val="22"/>
+          <w:color w:val="323232"/>
+          <w:sz w:val="21"/>
         </w:rPr>
-        <w:t>Schema 1: `market_data`</w:t>
+        <w:t xml:space="preserve">Berth Capacity: </w:t>
+      </w:r>
+      <w:r>
+        <w:rPr>
+          <w:rFonts w:ascii="Calibri" w:hAnsi="Calibri"/>
+          <w:color w:val="323232"/>
+          <w:sz w:val="21"/>
+        </w:rPr>
+        <w:t>sum_v x_v,t &lt;= B_max_p,t for all t  (Berth congestion throughput limit)</w:t>
       </w:r>
     </w:p>
     <w:p>
       <w:pPr>
         <w:pStyle w:val="ListBullet"/>
-        <w:spacing w:before="20" w:after="20"/>
-        <w:ind w:left="360"/>
+        <w:spacing w:after="60" w:line="276" w:lineRule="auto"/>
       </w:pPr>
       <w:r>
         <w:rPr>
-          <w:rFonts w:ascii="Consolas" w:hAnsi="Consolas"/>
-          <w:color w:val="1E40AF"/>
-          <w:sz w:val="19"/>
+          <w:rFonts w:ascii="Calibri" w:hAnsi="Calibri"/>
+          <w:b/>
+          <w:color w:val="323232"/>
+          <w:sz w:val="21"/>
         </w:rPr>
-        <w:t>id</w:t>
+        <w:t xml:space="preserve">Integrality: </w:t>
       </w:r>
       <w:r>
         <w:rPr>
           <w:rFonts w:ascii="Calibri" w:hAnsi="Calibri"/>
+          <w:color w:val="323232"/>
           <w:sz w:val="21"/>
         </w:rPr>
-        <w:t xml:space="preserve"> (Integer, Primary Key)</w:t>
+        <w:t>x_v,t in Z_&gt;=0  (Non-divisible, whole vessel charters)</w:t>
+      </w:r>
+    </w:p>
+    <w:p>
+      <w:pPr>
+        <w:keepNext/>
+        <w:spacing w:before="240" w:after="80"/>
+      </w:pPr>
+      <w:r>
+        <w:rPr>
+          <w:rFonts w:ascii="Calibri" w:hAnsi="Calibri"/>
+          <w:b/>
+          <w:color w:val="1E5A96"/>
+          <w:sz w:val="26"/>
+        </w:rPr>
+        <w:t>Layer 6: Enterprise Command Center UI (frontend/)</w:t>
       </w:r>
     </w:p>
     <w:p>
       <w:pPr>
         <w:pStyle w:val="ListBullet"/>
-        <w:spacing w:before="20" w:after="20"/>
-        <w:ind w:left="360"/>
+        <w:spacing w:after="60" w:line="276" w:lineRule="auto"/>
       </w:pPr>
       <w:r>
         <w:rPr>
-          <w:rFonts w:ascii="Consolas" w:hAnsi="Consolas"/>
-          <w:color w:val="1E40AF"/>
-          <w:sz w:val="19"/>
+          <w:rFonts w:ascii="Calibri" w:hAnsi="Calibri"/>
+          <w:b/>
+          <w:color w:val="323232"/>
+          <w:sz w:val="21"/>
         </w:rPr>
-        <w:t>index_name</w:t>
+        <w:t xml:space="preserve">Framework: </w:t>
       </w:r>
       <w:r>
         <w:rPr>
           <w:rFonts w:ascii="Calibri" w:hAnsi="Calibri"/>
+          <w:color w:val="323232"/>
           <w:sz w:val="21"/>
         </w:rPr>
-        <w:t xml:space="preserve"> (String: BCI, BPI, BSI, BRENT_CRUDE, USD_INR, BUNKER_SIN)</w:t>
+        <w:t>Next.js 14 App Router, React 18, TypeScript, and Server-Side Rendering (SSR).</w:t>
       </w:r>
     </w:p>
     <w:p>
       <w:pPr>
         <w:pStyle w:val="ListBullet"/>
-        <w:spacing w:before="20" w:after="20"/>
-        <w:ind w:left="360"/>
+        <w:spacing w:after="60" w:line="276" w:lineRule="auto"/>
       </w:pPr>
       <w:r>
         <w:rPr>
-          <w:rFonts w:ascii="Consolas" w:hAnsi="Consolas"/>
-          <w:color w:val="1E40AF"/>
-          <w:sz w:val="19"/>
+          <w:rFonts w:ascii="Calibri" w:hAnsi="Calibri"/>
+          <w:b/>
+          <w:color w:val="323232"/>
+          <w:sz w:val="21"/>
         </w:rPr>
-        <w:t>value</w:t>
+        <w:t xml:space="preserve">Visual Styling: </w:t>
       </w:r>
       <w:r>
         <w:rPr>
           <w:rFonts w:ascii="Calibri" w:hAnsi="Calibri"/>
+          <w:color w:val="323232"/>
           <w:sz w:val="21"/>
         </w:rPr>
-        <w:t xml:space="preserve"> (Float: Rate in points, USD/bbl, USD/MT, or INR)</w:t>
+        <w:t>Tailwind CSS dark theme (#090a0f, #12131a, #222430) compliant with National Informatics Centre (NIC) data density standards.</w:t>
       </w:r>
     </w:p>
     <w:p>
       <w:pPr>
         <w:pStyle w:val="ListBullet"/>
-        <w:spacing w:before="20" w:after="20"/>
-        <w:ind w:left="360"/>
+        <w:spacing w:after="60" w:line="276" w:lineRule="auto"/>
       </w:pPr>
       <w:r>
         <w:rPr>
-          <w:rFonts w:ascii="Consolas" w:hAnsi="Consolas"/>
-          <w:color w:val="1E40AF"/>
-          <w:sz w:val="19"/>
+          <w:rFonts w:ascii="Calibri" w:hAnsi="Calibri"/>
+          <w:b/>
+          <w:color w:val="323232"/>
+          <w:sz w:val="21"/>
         </w:rPr>
-        <w:t>recorded_at</w:t>
+        <w:t xml:space="preserve">Data Visualization: </w:t>
       </w:r>
       <w:r>
         <w:rPr>
           <w:rFonts w:ascii="Calibri" w:hAnsi="Calibri"/>
+          <w:color w:val="323232"/>
           <w:sz w:val="21"/>
         </w:rPr>
-        <w:t xml:space="preserve"> (Date, Indexed: Date of trade close)</w:t>
+        <w:t>Recharts ComposedChart rendering 60-day predictive curves with shaded 80% confidence envelopes and dual-currency conversion (USD $ and INR ₹ Crores).</w:t>
       </w:r>
     </w:p>
     <w:p>
       <w:pPr>
         <w:pStyle w:val="ListBullet"/>
-        <w:spacing w:before="20" w:after="20"/>
-        <w:ind w:left="360"/>
-      </w:pPr>
-      <w:r>
-        <w:rPr>
-          <w:rFonts w:ascii="Consolas" w:hAnsi="Consolas"/>
-          <w:color w:val="1E40AF"/>
-          <w:sz w:val="19"/>
-        </w:rPr>
-        <w:t>created_at</w:t>
-      </w:r>
-      <w:r>
-        <w:rPr>
-          <w:rFonts w:ascii="Calibri" w:hAnsi="Calibri"/>
-          <w:sz w:val="21"/>
-        </w:rPr>
-        <w:t xml:space="preserve"> (DateTime: System audit timestamp)</w:t>
-      </w:r>
-    </w:p>
-    <w:p>
-      <w:pPr>
-        <w:pStyle w:val="Heading4"/>
-        <w:spacing w:before="120" w:after="40"/>
+        <w:spacing w:after="60" w:line="276" w:lineRule="auto"/>
       </w:pPr>
       <w:r>
         <w:rPr>
           <w:rFonts w:ascii="Calibri" w:hAnsi="Calibri"/>
           <w:b/>
-          <w:color w:val="3B5988"/>
-          <w:sz w:val="22"/>
+          <w:color w:val="323232"/>
+          <w:sz w:val="21"/>
         </w:rPr>
-        <w:t>Schema 2: `port_data`</w:t>
+        <w:t xml:space="preserve">Interactive Simulation: </w:t>
+      </w:r>
+      <w:r>
+        <w:rPr>
+          <w:rFonts w:ascii="Calibri" w:hAnsi="Calibri"/>
+          <w:color w:val="323232"/>
+          <w:sz w:val="21"/>
+        </w:rPr>
+        <w:t>One-click disruption buttons (Suez Blockage, Red Sea Crisis, Monsoon Siltation) triggering real-time re-optimization.</w:t>
+      </w:r>
+    </w:p>
+    <w:p>
+      <w:pPr>
+        <w:keepNext/>
+        <w:spacing w:before="320" w:after="120"/>
+      </w:pPr>
+      <w:r>
+        <w:rPr>
+          <w:rFonts w:ascii="Calibri" w:hAnsi="Calibri"/>
+          <w:b/>
+          <w:color w:val="003366"/>
+          <w:sz w:val="32"/>
+        </w:rPr>
+        <w:t>3. Production Cloud Deployment Topology</w:t>
+      </w:r>
+    </w:p>
+    <w:p>
+      <w:pPr>
+        <w:spacing w:after="80" w:line="276" w:lineRule="auto"/>
+      </w:pPr>
+      <w:r>
+        <w:rPr>
+          <w:rFonts w:ascii="Calibri" w:hAnsi="Calibri"/>
+          <w:color w:val="323232"/>
+          <w:sz w:val="21"/>
+        </w:rPr>
+        <w:t>The production deployment utilizes a distributed, serverless cloud architecture:</w:t>
       </w:r>
     </w:p>
     <w:p>
       <w:pPr>
         <w:pStyle w:val="ListBullet"/>
-        <w:spacing w:before="20" w:after="20"/>
-        <w:ind w:left="360"/>
+        <w:spacing w:after="60" w:line="276" w:lineRule="auto"/>
       </w:pPr>
       <w:r>
         <w:rPr>
-          <w:rFonts w:ascii="Consolas" w:hAnsi="Consolas"/>
-          <w:color w:val="1E40AF"/>
-          <w:sz w:val="19"/>
+          <w:rFonts w:ascii="Calibri" w:hAnsi="Calibri"/>
+          <w:b/>
+          <w:color w:val="323232"/>
+          <w:sz w:val="21"/>
         </w:rPr>
-        <w:t>id</w:t>
+        <w:t xml:space="preserve">Frontend (Vercel): </w:t>
       </w:r>
       <w:r>
         <w:rPr>
           <w:rFonts w:ascii="Calibri" w:hAnsi="Calibri"/>
+          <w:color w:val="323232"/>
           <w:sz w:val="21"/>
         </w:rPr>
-        <w:t xml:space="preserve"> (Integer, Primary Key)</w:t>
+        <w:t>Vercel Edge Network hosts the Next.js 14 frontend with automated Git-triggered CI/CD builds, bypassing non-blocking lint errors for instant deployments.</w:t>
       </w:r>
     </w:p>
     <w:p>
       <w:pPr>
         <w:pStyle w:val="ListBullet"/>
-        <w:spacing w:before="20" w:after="20"/>
-        <w:ind w:left="360"/>
+        <w:spacing w:after="60" w:line="276" w:lineRule="auto"/>
       </w:pPr>
       <w:r>
         <w:rPr>
-          <w:rFonts w:ascii="Consolas" w:hAnsi="Consolas"/>
-          <w:color w:val="1E40AF"/>
-          <w:sz w:val="19"/>
+          <w:rFonts w:ascii="Calibri" w:hAnsi="Calibri"/>
+          <w:b/>
+          <w:color w:val="323232"/>
+          <w:sz w:val="21"/>
         </w:rPr>
-        <w:t>port_name</w:t>
+        <w:t xml:space="preserve">Backend (Render): </w:t>
       </w:r>
       <w:r>
         <w:rPr>
           <w:rFonts w:ascii="Calibri" w:hAnsi="Calibri"/>
+          <w:color w:val="323232"/>
           <w:sz w:val="21"/>
         </w:rPr>
-        <w:t xml:space="preserve"> (String: Paradip, Visakhapatnam, Haldia, Dhamra, Gangavaram)</w:t>
+        <w:t>Render hosts the FastAPI + Python ML services under an asynchronous Uvicorn worker managed by a production Procfile.</w:t>
       </w:r>
     </w:p>
     <w:p>
       <w:pPr>
         <w:pStyle w:val="ListBullet"/>
-        <w:spacing w:before="20" w:after="20"/>
-        <w:ind w:left="360"/>
+        <w:spacing w:after="60" w:line="276" w:lineRule="auto"/>
       </w:pPr>
       <w:r>
         <w:rPr>
-          <w:rFonts w:ascii="Consolas" w:hAnsi="Consolas"/>
-          <w:color w:val="1E40AF"/>
-          <w:sz w:val="19"/>
+          <w:rFonts w:ascii="Calibri" w:hAnsi="Calibri"/>
+          <w:b/>
+          <w:color w:val="323232"/>
+          <w:sz w:val="21"/>
         </w:rPr>
-        <w:t>max_draft_m</w:t>
+        <w:t xml:space="preserve">Database (Neon DB): </w:t>
       </w:r>
       <w:r>
         <w:rPr>
           <w:rFonts w:ascii="Calibri" w:hAnsi="Calibri"/>
+          <w:color w:val="323232"/>
           <w:sz w:val="21"/>
         </w:rPr>
-        <w:t xml:space="preserve"> (Float: Channel depth in meters)</w:t>
+        <w:t>Neon DB provides serverless PostgreSQL with connection pooling, SSL/TLS encryption, and automatic scaling.</w:t>
+      </w:r>
+    </w:p>
+    <w:p>
+      <w:pPr>
+        <w:keepNext/>
+        <w:spacing w:before="320" w:after="120"/>
+      </w:pPr>
+      <w:r>
+        <w:rPr>
+          <w:rFonts w:ascii="Calibri" w:hAnsi="Calibri"/>
+          <w:b/>
+          <w:color w:val="003366"/>
+          <w:sz w:val="32"/>
+        </w:rPr>
+        <w:t>4. Security, Auditability &amp; Governance</w:t>
       </w:r>
     </w:p>
     <w:p>
       <w:pPr>
         <w:pStyle w:val="ListBullet"/>
-        <w:spacing w:before="20" w:after="20"/>
-        <w:ind w:left="360"/>
+        <w:spacing w:after="60" w:line="276" w:lineRule="auto"/>
       </w:pPr>
       <w:r>
         <w:rPr>
-          <w:rFonts w:ascii="Consolas" w:hAnsi="Consolas"/>
-          <w:color w:val="1E40AF"/>
-          <w:sz w:val="19"/>
+          <w:rFonts w:ascii="Calibri" w:hAnsi="Calibri"/>
+          <w:b/>
+          <w:color w:val="323232"/>
+          <w:sz w:val="21"/>
         </w:rPr>
-        <w:t>current_waiting_hours</w:t>
+        <w:t xml:space="preserve">CVC/CAG Audit Compliance: </w:t>
       </w:r>
       <w:r>
         <w:rPr>
           <w:rFonts w:ascii="Calibri" w:hAnsi="Calibri"/>
+          <w:color w:val="323232"/>
           <w:sz w:val="21"/>
         </w:rPr>
-        <w:t xml:space="preserve"> (Float: Average berth waiting delay)</w:t>
+        <w:t>Every optimization execution is permanently logged in optimization_logs with input parameters, solver execution time, and dispatched vessel schedules for CVC and CAG audit compliance.</w:t>
       </w:r>
     </w:p>
     <w:p>
       <w:pPr>
         <w:pStyle w:val="ListBullet"/>
-        <w:spacing w:before="20" w:after="20"/>
-        <w:ind w:left="360"/>
+        <w:spacing w:after="60" w:line="276" w:lineRule="auto"/>
       </w:pPr>
       <w:r>
         <w:rPr>
-          <w:rFonts w:ascii="Consolas" w:hAnsi="Consolas"/>
-          <w:color w:val="1E40AF"/>
-          <w:sz w:val="19"/>
+          <w:rFonts w:ascii="Calibri" w:hAnsi="Calibri"/>
+          <w:b/>
+          <w:color w:val="323232"/>
+          <w:sz w:val="21"/>
         </w:rPr>
-        <w:t>berth_capacity</w:t>
+        <w:t xml:space="preserve">Data Sovereignty (MeitY): </w:t>
       </w:r>
       <w:r>
         <w:rPr>
           <w:rFonts w:ascii="Calibri" w:hAnsi="Calibri"/>
+          <w:color w:val="323232"/>
           <w:sz w:val="21"/>
         </w:rPr>
-        <w:t xml:space="preserve"> (Integer: Simultaneous bulk discharge berths)</w:t>
+        <w:t>The entire application can be deployed on private cloud or air-gapped on-premise government servers with zero data sent to external third-party SaaS vendors.</w:t>
       </w:r>
     </w:p>
     <w:p>
       <w:pPr>
         <w:pStyle w:val="ListBullet"/>
-        <w:spacing w:before="20" w:after="20"/>
-        <w:ind w:left="360"/>
-      </w:pPr>
-      <w:r>
-        <w:rPr>
-          <w:rFonts w:ascii="Consolas" w:hAnsi="Consolas"/>
-          <w:color w:val="1E40AF"/>
-          <w:sz w:val="19"/>
-        </w:rPr>
-        <w:t>recorded_at</w:t>
-      </w:r>
-      <w:r>
-        <w:rPr>
-          <w:rFonts w:ascii="Calibri" w:hAnsi="Calibri"/>
-          <w:sz w:val="21"/>
-        </w:rPr>
-        <w:t xml:space="preserve"> (Date)</w:t>
-      </w:r>
-    </w:p>
-    <w:p>
-      <w:pPr>
-        <w:pStyle w:val="Heading4"/>
-        <w:spacing w:before="120" w:after="40"/>
+        <w:spacing w:after="60" w:line="276" w:lineRule="auto"/>
       </w:pPr>
       <w:r>
         <w:rPr>
           <w:rFonts w:ascii="Calibri" w:hAnsi="Calibri"/>
           <w:b/>
-          <w:color w:val="3B5988"/>
-          <w:sz w:val="22"/>
+          <w:color w:val="323232"/>
+          <w:sz w:val="21"/>
         </w:rPr>
-        <w:t>Schema 3: `optimization_logs`</w:t>
-      </w:r>
-    </w:p>
-    <w:p>
-      <w:pPr>
-        <w:pStyle w:val="ListBullet"/>
-        <w:spacing w:before="20" w:after="20"/>
-        <w:ind w:left="360"/>
-      </w:pPr>
-      <w:r>
-        <w:rPr>
-          <w:rFonts w:ascii="Consolas" w:hAnsi="Consolas"/>
-          <w:color w:val="1E40AF"/>
-          <w:sz w:val="19"/>
-        </w:rPr>
-        <w:t>id</w:t>
+        <w:t xml:space="preserve">Role-Based Access (RBAC): </w:t>
       </w:r>
       <w:r>
         <w:rPr>
           <w:rFonts w:ascii="Calibri" w:hAnsi="Calibri"/>
+          <w:color w:val="323232"/>
           <w:sz w:val="21"/>
         </w:rPr>
-        <w:t xml:space="preserve"> (Integer, Primary Key)</w:t>
-      </w:r>
-    </w:p>
-    <w:p>
-      <w:pPr>
-        <w:pStyle w:val="ListBullet"/>
-        <w:spacing w:before="20" w:after="20"/>
-        <w:ind w:left="360"/>
-      </w:pPr>
-      <w:r>
-        <w:rPr>
-          <w:rFonts w:ascii="Consolas" w:hAnsi="Consolas"/>
-          <w:color w:val="1E40AF"/>
-          <w:sz w:val="19"/>
-        </w:rPr>
-        <w:t>target_port</w:t>
-      </w:r>
-      <w:r>
-        <w:rPr>
-          <w:rFonts w:ascii="Calibri" w:hAnsi="Calibri"/>
-          <w:sz w:val="21"/>
-        </w:rPr>
-        <w:t xml:space="preserve"> (String)</w:t>
-      </w:r>
-    </w:p>
-    <w:p>
-      <w:pPr>
-        <w:pStyle w:val="ListBullet"/>
-        <w:spacing w:before="20" w:after="20"/>
-        <w:ind w:left="360"/>
-      </w:pPr>
-      <w:r>
-        <w:rPr>
-          <w:rFonts w:ascii="Consolas" w:hAnsi="Consolas"/>
-          <w:color w:val="1E40AF"/>
-          <w:sz w:val="19"/>
-        </w:rPr>
-        <w:t>required_cargo_mt</w:t>
-      </w:r>
-      <w:r>
-        <w:rPr>
-          <w:rFonts w:ascii="Calibri" w:hAnsi="Calibri"/>
-          <w:sz w:val="21"/>
-        </w:rPr>
-        <w:t xml:space="preserve"> (Float)</w:t>
-      </w:r>
-    </w:p>
-    <w:p>
-      <w:pPr>
-        <w:pStyle w:val="ListBullet"/>
-        <w:spacing w:before="20" w:after="20"/>
-        <w:ind w:left="360"/>
-      </w:pPr>
-      <w:r>
-        <w:rPr>
-          <w:rFonts w:ascii="Consolas" w:hAnsi="Consolas"/>
-          <w:color w:val="1E40AF"/>
-          <w:sz w:val="19"/>
-        </w:rPr>
-        <w:t>planning_horizon_days</w:t>
-      </w:r>
-      <w:r>
-        <w:rPr>
-          <w:rFonts w:ascii="Calibri" w:hAnsi="Calibri"/>
-          <w:sz w:val="21"/>
-        </w:rPr>
-        <w:t xml:space="preserve"> (Integer)</w:t>
-      </w:r>
-    </w:p>
-    <w:p>
-      <w:pPr>
-        <w:pStyle w:val="ListBullet"/>
-        <w:spacing w:before="20" w:after="20"/>
-        <w:ind w:left="360"/>
-      </w:pPr>
-      <w:r>
-        <w:rPr>
-          <w:rFonts w:ascii="Consolas" w:hAnsi="Consolas"/>
-          <w:color w:val="1E40AF"/>
-          <w:sz w:val="19"/>
-        </w:rPr>
-        <w:t>total_cost_usd</w:t>
-      </w:r>
-      <w:r>
-        <w:rPr>
-          <w:rFonts w:ascii="Calibri" w:hAnsi="Calibri"/>
-          <w:sz w:val="21"/>
-        </w:rPr>
-        <w:t xml:space="preserve"> (Float)</w:t>
-      </w:r>
-    </w:p>
-    <w:p>
-      <w:pPr>
-        <w:pStyle w:val="ListBullet"/>
-        <w:spacing w:before="20" w:after="20"/>
-        <w:ind w:left="360"/>
-      </w:pPr>
-      <w:r>
-        <w:rPr>
-          <w:rFonts w:ascii="Consolas" w:hAnsi="Consolas"/>
-          <w:color w:val="1E40AF"/>
-          <w:sz w:val="19"/>
-        </w:rPr>
-        <w:t>savings_usd</w:t>
-      </w:r>
-      <w:r>
-        <w:rPr>
-          <w:rFonts w:ascii="Calibri" w:hAnsi="Calibri"/>
-          <w:sz w:val="21"/>
-        </w:rPr>
-        <w:t xml:space="preserve"> (Float)</w:t>
-      </w:r>
-    </w:p>
-    <w:p>
-      <w:pPr>
-        <w:pStyle w:val="ListBullet"/>
-        <w:spacing w:before="20" w:after="20"/>
-        <w:ind w:left="360"/>
-      </w:pPr>
-      <w:r>
-        <w:rPr>
-          <w:rFonts w:ascii="Consolas" w:hAnsi="Consolas"/>
-          <w:color w:val="1E40AF"/>
-          <w:sz w:val="19"/>
-        </w:rPr>
-        <w:t>vessel_schedule_json</w:t>
-      </w:r>
-      <w:r>
-        <w:rPr>
-          <w:rFonts w:ascii="Calibri" w:hAnsi="Calibri"/>
-          <w:sz w:val="21"/>
-        </w:rPr>
-        <w:t xml:space="preserve"> (JSONB)</w:t>
-      </w:r>
-    </w:p>
-    <w:p>
-      <w:pPr>
-        <w:pStyle w:val="ListBullet"/>
-        <w:spacing w:before="20" w:after="20"/>
-        <w:ind w:left="360"/>
-      </w:pPr>
-      <w:r>
-        <w:rPr>
-          <w:rFonts w:ascii="Consolas" w:hAnsi="Consolas"/>
-          <w:color w:val="1E40AF"/>
-          <w:sz w:val="19"/>
-        </w:rPr>
-        <w:t>executed_at</w:t>
-      </w:r>
-      <w:r>
-        <w:rPr>
-          <w:rFonts w:ascii="Calibri" w:hAnsi="Calibri"/>
-          <w:sz w:val="21"/>
-        </w:rPr>
-        <w:t xml:space="preserve"> (DateTime)</w:t>
-      </w:r>
-    </w:p>
-    <w:p>
-      <w:pPr>
-        <w:spacing w:before="40" w:after="80"/>
-      </w:pPr>
-      <w:r>
-        <w:rPr>
-          <w:rFonts w:ascii="Calibri" w:hAnsi="Calibri"/>
-          <w:sz w:val="21"/>
-        </w:rPr>
-        <w:t>---</w:t>
-      </w:r>
-    </w:p>
-    <w:p>
-      <w:pPr>
-        <w:pStyle w:val="Heading3"/>
-        <w:spacing w:before="160" w:after="60"/>
-      </w:pPr>
-      <w:r>
-        <w:rPr>
-          <w:rFonts w:ascii="Calibri" w:hAnsi="Calibri"/>
-          <w:b/>
-          <w:color w:val="2B4C7E"/>
-          <w:sz w:val="24"/>
-        </w:rPr>
-        <w:t>Layer 3: FastAPI Backend Services (`backend/routers/`)</w:t>
-      </w:r>
-    </w:p>
-    <w:p>
-      <w:pPr>
-        <w:spacing w:before="40" w:after="80"/>
-      </w:pPr>
-      <w:r>
-        <w:rPr>
-          <w:rFonts w:ascii="Calibri" w:hAnsi="Calibri"/>
-          <w:sz w:val="21"/>
-        </w:rPr>
-        <w:t>Implements an asynchronous, high-throughput RESTful service layer:</w:t>
-      </w:r>
-    </w:p>
-    <w:p>
-      <w:pPr>
-        <w:pStyle w:val="ListBullet"/>
-        <w:spacing w:before="20" w:after="20"/>
-        <w:ind w:left="360"/>
-      </w:pPr>
-      <w:r>
-        <w:rPr>
-          <w:rFonts w:ascii="Calibri" w:hAnsi="Calibri"/>
-          <w:b/>
-          <w:color w:val="111827"/>
-          <w:sz w:val="21"/>
-        </w:rPr>
-        <w:t>`health.py`</w:t>
-      </w:r>
-      <w:r>
-        <w:rPr>
-          <w:rFonts w:ascii="Calibri" w:hAnsi="Calibri"/>
-          <w:sz w:val="21"/>
-        </w:rPr>
-        <w:t>: Validates database connection pools and solver readiness.</w:t>
-      </w:r>
-    </w:p>
-    <w:p>
-      <w:pPr>
-        <w:pStyle w:val="ListBullet"/>
-        <w:spacing w:before="20" w:after="20"/>
-        <w:ind w:left="360"/>
-      </w:pPr>
-      <w:r>
-        <w:rPr>
-          <w:rFonts w:ascii="Calibri" w:hAnsi="Calibri"/>
-          <w:b/>
-          <w:color w:val="111827"/>
-          <w:sz w:val="21"/>
-        </w:rPr>
-        <w:t>`market_data.py`</w:t>
-      </w:r>
-      <w:r>
-        <w:rPr>
-          <w:rFonts w:ascii="Calibri" w:hAnsi="Calibri"/>
-          <w:sz w:val="21"/>
-        </w:rPr>
-        <w:t>: Provides fast time-series queries and bulk ingestion endpoints.</w:t>
-      </w:r>
-    </w:p>
-    <w:p>
-      <w:pPr>
-        <w:pStyle w:val="ListBullet"/>
-        <w:spacing w:before="20" w:after="20"/>
-        <w:ind w:left="360"/>
-      </w:pPr>
-      <w:r>
-        <w:rPr>
-          <w:rFonts w:ascii="Calibri" w:hAnsi="Calibri"/>
-          <w:b/>
-          <w:color w:val="111827"/>
-          <w:sz w:val="21"/>
-        </w:rPr>
-        <w:t>`port_data.py`</w:t>
-      </w:r>
-      <w:r>
-        <w:rPr>
-          <w:rFonts w:ascii="Calibri" w:hAnsi="Calibri"/>
-          <w:sz w:val="21"/>
-        </w:rPr>
-        <w:t>: Manages dynamic port draft thresholds and congestion telemetry.</w:t>
-      </w:r>
-    </w:p>
-    <w:p>
-      <w:pPr>
-        <w:pStyle w:val="ListBullet"/>
-        <w:spacing w:before="20" w:after="20"/>
-        <w:ind w:left="360"/>
-      </w:pPr>
-      <w:r>
-        <w:rPr>
-          <w:rFonts w:ascii="Calibri" w:hAnsi="Calibri"/>
-          <w:b/>
-          <w:color w:val="111827"/>
-          <w:sz w:val="21"/>
-        </w:rPr>
-        <w:t>`forecasts.py`</w:t>
-      </w:r>
-      <w:r>
-        <w:rPr>
-          <w:rFonts w:ascii="Calibri" w:hAnsi="Calibri"/>
-          <w:sz w:val="21"/>
-        </w:rPr>
-        <w:t>: Invokes the ML forecasting engine and returns 60-day point estimates and 80% confidence interval bands.</w:t>
-      </w:r>
-    </w:p>
-    <w:p>
-      <w:pPr>
-        <w:pStyle w:val="ListBullet"/>
-        <w:spacing w:before="20" w:after="20"/>
-        <w:ind w:left="360"/>
-      </w:pPr>
-      <w:r>
-        <w:rPr>
-          <w:rFonts w:ascii="Calibri" w:hAnsi="Calibri"/>
-          <w:b/>
-          <w:color w:val="111827"/>
-          <w:sz w:val="21"/>
-        </w:rPr>
-        <w:t>`optimization.py`</w:t>
-      </w:r>
-      <w:r>
-        <w:rPr>
-          <w:rFonts w:ascii="Calibri" w:hAnsi="Calibri"/>
-          <w:sz w:val="21"/>
-        </w:rPr>
-        <w:t>: Validates procurement constraints, builds the MILP objective matrix, calls the PuLP solver, and computes landed cost savings against spot benchmarks.</w:t>
-      </w:r>
-    </w:p>
-    <w:p>
-      <w:pPr>
-        <w:spacing w:before="40" w:after="80"/>
-      </w:pPr>
-      <w:r>
-        <w:rPr>
-          <w:rFonts w:ascii="Calibri" w:hAnsi="Calibri"/>
-          <w:sz w:val="21"/>
-        </w:rPr>
-        <w:t>---</w:t>
-      </w:r>
-    </w:p>
-    <w:p>
-      <w:pPr>
-        <w:pStyle w:val="Heading3"/>
-        <w:spacing w:before="160" w:after="60"/>
-      </w:pPr>
-      <w:r>
-        <w:rPr>
-          <w:rFonts w:ascii="Calibri" w:hAnsi="Calibri"/>
-          <w:b/>
-          <w:color w:val="2B4C7E"/>
-          <w:sz w:val="24"/>
-        </w:rPr>
-        <w:t>Layer 4: Hybrid Machine Learning Engine (`ml_engine/forecasting/`)</w:t>
-      </w:r>
-    </w:p>
-    <w:p>
-      <w:pPr>
-        <w:spacing w:before="40" w:after="80"/>
-      </w:pPr>
-      <w:r>
-        <w:rPr>
-          <w:rFonts w:ascii="Calibri" w:hAnsi="Calibri"/>
-          <w:sz w:val="21"/>
-        </w:rPr>
-        <w:t>A dual-tier predictive framework designed to avoid the pitfalls of naive single-model time-series forecasting:</w:t>
-      </w:r>
-    </w:p>
-    <w:p>
-      <w:pPr>
-        <w:pStyle w:val="ListNumber"/>
-        <w:spacing w:before="40" w:after="40"/>
-      </w:pPr>
-      <w:r>
-        <w:rPr>
-          <w:rFonts w:ascii="Calibri" w:hAnsi="Calibri"/>
-          <w:b/>
-          <w:color w:val="111827"/>
-          <w:sz w:val="21"/>
-        </w:rPr>
-        <w:t>Short-Horizon Model (Days 1–15)</w:t>
-      </w:r>
-      <w:r>
-        <w:rPr>
-          <w:rFonts w:ascii="Calibri" w:hAnsi="Calibri"/>
-          <w:sz w:val="21"/>
-        </w:rPr>
-        <w:t>:</w:t>
-      </w:r>
-    </w:p>
-    <w:p>
-      <w:pPr>
-        <w:pStyle w:val="ListBullet"/>
-        <w:spacing w:before="20" w:after="20"/>
-        <w:ind w:left="720"/>
-      </w:pPr>
-      <w:r>
-        <w:rPr>
-          <w:rFonts w:ascii="Calibri" w:hAnsi="Calibri"/>
-          <w:b/>
-          <w:color w:val="111827"/>
-          <w:sz w:val="21"/>
-        </w:rPr>
-        <w:t>Algorithm</w:t>
-      </w:r>
-      <w:r>
-        <w:rPr>
-          <w:rFonts w:ascii="Calibri" w:hAnsi="Calibri"/>
-          <w:sz w:val="21"/>
-        </w:rPr>
-        <w:t>: LightGBM Gradient-Boosted Decision Trees.</w:t>
-      </w:r>
-    </w:p>
-    <w:p>
-      <w:pPr>
-        <w:pStyle w:val="ListBullet"/>
-        <w:spacing w:before="20" w:after="20"/>
-        <w:ind w:left="720"/>
-      </w:pPr>
-      <w:r>
-        <w:rPr>
-          <w:rFonts w:ascii="Calibri" w:hAnsi="Calibri"/>
-          <w:b/>
-          <w:color w:val="111827"/>
-          <w:sz w:val="21"/>
-        </w:rPr>
-        <w:t>Engineered Features</w:t>
-      </w:r>
-      <w:r>
-        <w:rPr>
-          <w:rFonts w:ascii="Calibri" w:hAnsi="Calibri"/>
-          <w:sz w:val="21"/>
-        </w:rPr>
-        <w:t>: 1-day, 2-day, 3-day, 7-day, 14-day lagged values; 7-day rolling mean; 7-day rolling standard deviation (volatility proxy); and macro Brent Crude / Bunker fuel covariance.</w:t>
-      </w:r>
-    </w:p>
-    <w:p>
-      <w:pPr>
-        <w:pStyle w:val="ListBullet"/>
-        <w:spacing w:before="20" w:after="20"/>
-        <w:ind w:left="720"/>
-      </w:pPr>
-      <w:r>
-        <w:rPr>
-          <w:rFonts w:ascii="Calibri" w:hAnsi="Calibri"/>
-          <w:b/>
-          <w:color w:val="111827"/>
-          <w:sz w:val="21"/>
-        </w:rPr>
-        <w:t>Target</w:t>
-      </w:r>
-      <w:r>
-        <w:rPr>
-          <w:rFonts w:ascii="Calibri" w:hAnsi="Calibri"/>
-          <w:sz w:val="21"/>
-        </w:rPr>
-        <w:t>: Short-term non-linear rate swings and immediate momentum.</w:t>
-      </w:r>
-    </w:p>
-    <w:p>
-      <w:pPr>
-        <w:pStyle w:val="ListNumber"/>
-        <w:spacing w:before="40" w:after="40"/>
-      </w:pPr>
-      <w:r>
-        <w:rPr>
-          <w:rFonts w:ascii="Calibri" w:hAnsi="Calibri"/>
-          <w:b/>
-          <w:color w:val="111827"/>
-          <w:sz w:val="21"/>
-        </w:rPr>
-        <w:t>Medium-Horizon Model (Days 16–60)</w:t>
-      </w:r>
-      <w:r>
-        <w:rPr>
-          <w:rFonts w:ascii="Calibri" w:hAnsi="Calibri"/>
-          <w:sz w:val="21"/>
-        </w:rPr>
-        <w:t>:</w:t>
-      </w:r>
-    </w:p>
-    <w:p>
-      <w:pPr>
-        <w:pStyle w:val="ListBullet"/>
-        <w:spacing w:before="20" w:after="20"/>
-        <w:ind w:left="720"/>
-      </w:pPr>
-      <w:r>
-        <w:rPr>
-          <w:rFonts w:ascii="Calibri" w:hAnsi="Calibri"/>
-          <w:b/>
-          <w:color w:val="111827"/>
-          <w:sz w:val="21"/>
-        </w:rPr>
-        <w:t>Algorithm</w:t>
-      </w:r>
-      <w:r>
-        <w:rPr>
-          <w:rFonts w:ascii="Calibri" w:hAnsi="Calibri"/>
-          <w:sz w:val="21"/>
-        </w:rPr>
-        <w:t>: Decomposed Additive Seasonal Model (Prophet / Holt-Winters Exponential Trend).</w:t>
-      </w:r>
-    </w:p>
-    <w:p>
-      <w:pPr>
-        <w:pStyle w:val="ListBullet"/>
-        <w:spacing w:before="20" w:after="20"/>
-        <w:ind w:left="720"/>
-      </w:pPr>
-      <w:r>
-        <w:rPr>
-          <w:rFonts w:ascii="Calibri" w:hAnsi="Calibri"/>
-          <w:b/>
-          <w:color w:val="111827"/>
-          <w:sz w:val="21"/>
-        </w:rPr>
-        <w:t>Confidence Envelope</w:t>
-      </w:r>
-      <w:r>
-        <w:rPr>
-          <w:rFonts w:ascii="Calibri" w:hAnsi="Calibri"/>
-          <w:sz w:val="21"/>
-        </w:rPr>
-        <w:t xml:space="preserve">: Evaluates residual variance to compute </w:t>
-      </w:r>
-      <w:r>
-        <w:rPr>
-          <w:rFonts w:ascii="Calibri" w:hAnsi="Calibri"/>
-          <w:b/>
-          <w:color w:val="111827"/>
-          <w:sz w:val="21"/>
-        </w:rPr>
-        <w:t>80% Statistical Confidence Intervals</w:t>
-      </w:r>
-      <w:r>
-        <w:rPr>
-          <w:rFonts w:ascii="Calibri" w:hAnsi="Calibri"/>
-          <w:sz w:val="21"/>
-        </w:rPr>
-        <w:t xml:space="preserve"> ($[\hat{y}_t - 1.28\sigma_t, \hat{y}_t + 1.28\sigma_t]$).</w:t>
-      </w:r>
-    </w:p>
-    <w:p>
-      <w:pPr>
-        <w:pStyle w:val="ListNumber"/>
-        <w:spacing w:before="40" w:after="40"/>
-      </w:pPr>
-      <w:r>
-        <w:rPr>
-          <w:rFonts w:ascii="Calibri" w:hAnsi="Calibri"/>
-          <w:b/>
-          <w:color w:val="111827"/>
-          <w:sz w:val="21"/>
-        </w:rPr>
-        <w:t>Transition Smoother</w:t>
-      </w:r>
-      <w:r>
-        <w:rPr>
-          <w:rFonts w:ascii="Calibri" w:hAnsi="Calibri"/>
-          <w:sz w:val="21"/>
-        </w:rPr>
-        <w:t>: Employs a linear sigmoid blending bridge between Day 14 and Day 17 to ensure continuous, non-divergent trajectory handover.</w:t>
-      </w:r>
-    </w:p>
-    <w:p>
-      <w:pPr>
-        <w:spacing w:before="40" w:after="80"/>
-      </w:pPr>
-      <w:r>
-        <w:rPr>
-          <w:rFonts w:ascii="Calibri" w:hAnsi="Calibri"/>
-          <w:sz w:val="21"/>
-        </w:rPr>
-        <w:t>---</w:t>
-      </w:r>
-    </w:p>
-    <w:p>
-      <w:pPr>
-        <w:pStyle w:val="Heading3"/>
-        <w:spacing w:before="160" w:after="60"/>
-      </w:pPr>
-      <w:r>
-        <w:rPr>
-          <w:rFonts w:ascii="Calibri" w:hAnsi="Calibri"/>
-          <w:b/>
-          <w:color w:val="2B4C7E"/>
-          <w:sz w:val="24"/>
-        </w:rPr>
-        <w:t>Layer 5: MILP Operations Research Optimizer (`ml_engine/optimization/`)</w:t>
-      </w:r>
-    </w:p>
-    <w:p>
-      <w:pPr>
-        <w:spacing w:before="40" w:after="80"/>
-      </w:pPr>
-      <w:r>
-        <w:rPr>
-          <w:rFonts w:ascii="Calibri" w:hAnsi="Calibri"/>
-          <w:sz w:val="21"/>
-        </w:rPr>
-        <w:t xml:space="preserve">Formulates vessel chartering as a </w:t>
-      </w:r>
-      <w:r>
-        <w:rPr>
-          <w:rFonts w:ascii="Calibri" w:hAnsi="Calibri"/>
-          <w:b/>
-          <w:color w:val="111827"/>
-          <w:sz w:val="21"/>
-        </w:rPr>
-        <w:t>Mixed-Integer Linear Program (MILP)</w:t>
-      </w:r>
-      <w:r>
-        <w:rPr>
-          <w:rFonts w:ascii="Calibri" w:hAnsi="Calibri"/>
-          <w:sz w:val="21"/>
-        </w:rPr>
-        <w:t xml:space="preserve"> solved via the </w:t>
-      </w:r>
-      <w:r>
-        <w:rPr>
-          <w:rFonts w:ascii="Calibri" w:hAnsi="Calibri"/>
-          <w:b/>
-          <w:color w:val="111827"/>
-          <w:sz w:val="21"/>
-        </w:rPr>
-        <w:t>PuLP CBC Branch-and-Cut</w:t>
-      </w:r>
-      <w:r>
-        <w:rPr>
-          <w:rFonts w:ascii="Calibri" w:hAnsi="Calibri"/>
-          <w:sz w:val="21"/>
-        </w:rPr>
-        <w:t xml:space="preserve"> engine.</w:t>
-      </w:r>
-    </w:p>
-    <w:p>
-      <w:pPr>
-        <w:pStyle w:val="Heading4"/>
-        <w:spacing w:before="120" w:after="40"/>
-      </w:pPr>
-      <w:r>
-        <w:rPr>
-          <w:rFonts w:ascii="Calibri" w:hAnsi="Calibri"/>
-          <w:b/>
-          <w:color w:val="3B5988"/>
-          <w:sz w:val="22"/>
-        </w:rPr>
-        <w:t>Mathematical Model:</w:t>
-      </w:r>
-    </w:p>
-    <w:p>
-      <w:pPr>
-        <w:spacing w:before="40" w:after="80"/>
-      </w:pPr>
-      <w:r>
-        <w:rPr>
-          <w:rFonts w:ascii="Calibri" w:hAnsi="Calibri"/>
-          <w:b/>
-          <w:color w:val="111827"/>
-          <w:sz w:val="21"/>
-        </w:rPr>
-        <w:t>Sets &amp; Indices</w:t>
-      </w:r>
-      <w:r>
-        <w:rPr>
-          <w:rFonts w:ascii="Calibri" w:hAnsi="Calibri"/>
-          <w:sz w:val="21"/>
-        </w:rPr>
-        <w:t>:</w:t>
-      </w:r>
-    </w:p>
-    <w:p>
-      <w:pPr>
-        <w:pStyle w:val="ListBullet"/>
-        <w:spacing w:before="20" w:after="20"/>
-        <w:ind w:left="360"/>
-      </w:pPr>
-      <w:r>
-        <w:rPr>
-          <w:rFonts w:ascii="Calibri" w:hAnsi="Calibri"/>
-          <w:sz w:val="21"/>
-        </w:rPr>
-        <w:t>$V = \{\text{Capesize (150k MT)}, \text{Panamax (80k MT)}, \text{Supramax (50k MT)}\}$</w:t>
-      </w:r>
-    </w:p>
-    <w:p>
-      <w:pPr>
-        <w:pStyle w:val="ListBullet"/>
-        <w:spacing w:before="20" w:after="20"/>
-        <w:ind w:left="360"/>
-      </w:pPr>
-      <w:r>
-        <w:rPr>
-          <w:rFonts w:ascii="Calibri" w:hAnsi="Calibri"/>
-          <w:sz w:val="21"/>
-        </w:rPr>
-        <w:t>$T = \{1, 2, \dots, H\}$ (Planning horizon days, $H \le 60$)</w:t>
-      </w:r>
-    </w:p>
-    <w:p>
-      <w:pPr>
-        <w:pStyle w:val="ListBullet"/>
-        <w:spacing w:before="20" w:after="20"/>
-        <w:ind w:left="360"/>
-      </w:pPr>
-      <w:r>
-        <w:rPr>
-          <w:rFonts w:ascii="Calibri" w:hAnsi="Calibri"/>
-          <w:sz w:val="21"/>
-        </w:rPr>
-        <w:t>$P$ = Target Indian discharge port</w:t>
-      </w:r>
-    </w:p>
-    <w:p>
-      <w:pPr>
-        <w:spacing w:before="40" w:after="80"/>
-      </w:pPr>
-      <w:r>
-        <w:rPr>
-          <w:rFonts w:ascii="Calibri" w:hAnsi="Calibri"/>
-          <w:b/>
-          <w:color w:val="111827"/>
-          <w:sz w:val="21"/>
-        </w:rPr>
-        <w:t>Decision Variables</w:t>
-      </w:r>
-      <w:r>
-        <w:rPr>
-          <w:rFonts w:ascii="Calibri" w:hAnsi="Calibri"/>
-          <w:sz w:val="21"/>
-        </w:rPr>
-        <w:t>:</w:t>
-      </w:r>
-    </w:p>
-    <w:p>
-      <w:pPr>
-        <w:pStyle w:val="ListBullet"/>
-        <w:spacing w:before="20" w:after="20"/>
-        <w:ind w:left="360"/>
-      </w:pPr>
-      <w:r>
-        <w:rPr>
-          <w:rFonts w:ascii="Calibri" w:hAnsi="Calibri"/>
-          <w:sz w:val="21"/>
-        </w:rPr>
-        <w:t>$x_{v, t} \in \mathbb{Z}_{\ge 0}$: Number of vessels of class $v$ chartered on departure day $t$.</w:t>
-      </w:r>
-    </w:p>
-    <w:p>
-      <w:pPr>
-        <w:spacing w:before="40" w:after="80"/>
-      </w:pPr>
-      <w:r>
-        <w:rPr>
-          <w:rFonts w:ascii="Calibri" w:hAnsi="Calibri"/>
-          <w:b/>
-          <w:color w:val="111827"/>
-          <w:sz w:val="21"/>
-        </w:rPr>
-        <w:t>Objective Function</w:t>
-      </w:r>
-      <w:r>
-        <w:rPr>
-          <w:rFonts w:ascii="Calibri" w:hAnsi="Calibri"/>
-          <w:sz w:val="21"/>
-        </w:rPr>
-        <w:t>: Minimize Total Landed Procurement Cost:</w:t>
-      </w:r>
-    </w:p>
-    <w:p>
-      <w:pPr>
-        <w:spacing w:before="40" w:after="80"/>
-      </w:pPr>
-      <w:r>
-        <w:rPr>
-          <w:rFonts w:ascii="Calibri" w:hAnsi="Calibri"/>
-          <w:sz w:val="21"/>
-        </w:rPr>
-        <w:t>$$\min \sum_{t \in T} \sum_{v \in V} \left[ \left( \hat{R}_{v, t} \cdot \text{Cap}_v \right) + C_{\text{mob}, v} + \left( W_P \cdot D_v \right) \right] \cdot x_{v, t}$$</w:t>
-      </w:r>
-    </w:p>
-    <w:p>
-      <w:pPr>
-        <w:spacing w:before="40" w:after="80"/>
-      </w:pPr>
-      <w:r>
-        <w:rPr>
-          <w:rFonts w:ascii="Calibri" w:hAnsi="Calibri"/>
-          <w:sz w:val="21"/>
-        </w:rPr>
-        <w:t>Where:</w:t>
-      </w:r>
-    </w:p>
-    <w:p>
-      <w:pPr>
-        <w:pStyle w:val="ListBullet"/>
-        <w:spacing w:before="20" w:after="20"/>
-        <w:ind w:left="360"/>
-      </w:pPr>
-      <w:r>
-        <w:rPr>
-          <w:rFonts w:ascii="Calibri" w:hAnsi="Calibri"/>
-          <w:sz w:val="21"/>
-        </w:rPr>
-        <w:t>$\hat{R}_{v, t}$: Forecasted freight rate $(\$/\text{MT})$ for vessel $v$ on day $t$.</w:t>
-      </w:r>
-    </w:p>
-    <w:p>
-      <w:pPr>
-        <w:pStyle w:val="ListBullet"/>
-        <w:spacing w:before="20" w:after="20"/>
-        <w:ind w:left="360"/>
-      </w:pPr>
-      <w:r>
-        <w:rPr>
-          <w:rFonts w:ascii="Calibri" w:hAnsi="Calibri"/>
-          <w:sz w:val="21"/>
-        </w:rPr>
-        <w:t>$\text{Cap}_v$: Vessel nominal capacity in Metric Tonnes.</w:t>
-      </w:r>
-    </w:p>
-    <w:p>
-      <w:pPr>
-        <w:pStyle w:val="ListBullet"/>
-        <w:spacing w:before="20" w:after="20"/>
-        <w:ind w:left="360"/>
-      </w:pPr>
-      <w:r>
-        <w:rPr>
-          <w:rFonts w:ascii="Calibri" w:hAnsi="Calibri"/>
-          <w:sz w:val="21"/>
-        </w:rPr>
-        <w:t>$C_{\text{mob}, v}$: Fixed mobilization and port tariff overhead.</w:t>
-      </w:r>
-    </w:p>
-    <w:p>
-      <w:pPr>
-        <w:pStyle w:val="ListBullet"/>
-        <w:spacing w:before="20" w:after="20"/>
-        <w:ind w:left="360"/>
-      </w:pPr>
-      <w:r>
-        <w:rPr>
-          <w:rFonts w:ascii="Calibri" w:hAnsi="Calibri"/>
-          <w:sz w:val="21"/>
-        </w:rPr>
-        <w:t>$W_P$: Expected port waiting delay (hours).</w:t>
-      </w:r>
-    </w:p>
-    <w:p>
-      <w:pPr>
-        <w:pStyle w:val="ListBullet"/>
-        <w:spacing w:before="20" w:after="20"/>
-        <w:ind w:left="360"/>
-      </w:pPr>
-      <w:r>
-        <w:rPr>
-          <w:rFonts w:ascii="Calibri" w:hAnsi="Calibri"/>
-          <w:sz w:val="21"/>
-        </w:rPr>
-        <w:t>$D_v$: Hourly demurrage penalty rate for vessel class $v$.</w:t>
-      </w:r>
-    </w:p>
-    <w:p>
-      <w:pPr>
-        <w:spacing w:before="40" w:after="80"/>
-      </w:pPr>
-      <w:r>
-        <w:rPr>
-          <w:rFonts w:ascii="Calibri" w:hAnsi="Calibri"/>
-          <w:b/>
-          <w:color w:val="111827"/>
-          <w:sz w:val="21"/>
-        </w:rPr>
-        <w:t>Constraints</w:t>
-      </w:r>
-      <w:r>
-        <w:rPr>
-          <w:rFonts w:ascii="Calibri" w:hAnsi="Calibri"/>
-          <w:sz w:val="21"/>
-        </w:rPr>
-        <w:t>:</w:t>
-      </w:r>
-    </w:p>
-    <w:p>
-      <w:pPr>
-        <w:pStyle w:val="ListNumber"/>
-        <w:spacing w:before="40" w:after="40"/>
-      </w:pPr>
-      <w:r>
-        <w:rPr>
-          <w:rFonts w:ascii="Calibri" w:hAnsi="Calibri"/>
-          <w:b/>
-          <w:color w:val="111827"/>
-          <w:sz w:val="21"/>
-        </w:rPr>
-        <w:t>Demand Satisfaction</w:t>
-      </w:r>
-      <w:r>
-        <w:rPr>
-          <w:rFonts w:ascii="Calibri" w:hAnsi="Calibri"/>
-          <w:sz w:val="21"/>
-        </w:rPr>
-        <w:t>:</w:t>
-      </w:r>
-    </w:p>
-    <w:p>
-      <w:pPr>
-        <w:spacing w:before="40" w:after="80"/>
-      </w:pPr>
-      <w:r>
-        <w:rPr>
-          <w:rFonts w:ascii="Calibri" w:hAnsi="Calibri"/>
-          <w:sz w:val="21"/>
-        </w:rPr>
-        <w:t xml:space="preserve">   $$\sum_{t \in T} \sum_{v \in V} \left( \text{Cap}_v \cdot x_{v, t} \right) \ge \text{Demand}_{\text{required}}$$</w:t>
-      </w:r>
-    </w:p>
-    <w:p>
-      <w:pPr>
-        <w:pStyle w:val="ListNumber"/>
-        <w:spacing w:before="40" w:after="40"/>
-      </w:pPr>
-      <w:r>
-        <w:rPr>
-          <w:rFonts w:ascii="Calibri" w:hAnsi="Calibri"/>
-          <w:b/>
-          <w:color w:val="111827"/>
-          <w:sz w:val="21"/>
-        </w:rPr>
-        <w:t>Port Draft Restriction</w:t>
-      </w:r>
-      <w:r>
-        <w:rPr>
-          <w:rFonts w:ascii="Calibri" w:hAnsi="Calibri"/>
-          <w:sz w:val="21"/>
-        </w:rPr>
-        <w:t>:</w:t>
-      </w:r>
-    </w:p>
-    <w:p>
-      <w:pPr>
-        <w:spacing w:before="40" w:after="80"/>
-      </w:pPr>
-      <w:r>
-        <w:rPr>
-          <w:rFonts w:ascii="Calibri" w:hAnsi="Calibri"/>
-          <w:sz w:val="21"/>
-        </w:rPr>
-        <w:t xml:space="preserve">   $$x_{v, t} = 0 \quad \forall v \text{ where } \text{Draft}_v &gt; \text{MaxDraft}_P$$</w:t>
-      </w:r>
-    </w:p>
-    <w:p>
-      <w:pPr>
-        <w:spacing w:before="40" w:after="80"/>
-      </w:pPr>
-      <w:r>
-        <w:rPr>
-          <w:rFonts w:ascii="Calibri" w:hAnsi="Calibri"/>
-          <w:sz w:val="21"/>
-        </w:rPr>
-        <w:t xml:space="preserve">   </w:t>
-      </w:r>
-      <w:r>
-        <w:rPr>
-          <w:rFonts w:ascii="Calibri" w:hAnsi="Calibri"/>
-          <w:i/>
-          <w:sz w:val="21"/>
-        </w:rPr>
-        <w:t>(e.g., if $\text{MaxDraft}_{\text{Haldia}} = 12.0\text{m}$, Capesize ($17.0\text{m}$) and Panamax ($14.0\text{m}$) are strictly forced to 0).</w:t>
-      </w:r>
-    </w:p>
-    <w:p>
-      <w:pPr>
-        <w:pStyle w:val="ListNumber"/>
-        <w:spacing w:before="40" w:after="40"/>
-      </w:pPr>
-      <w:r>
-        <w:rPr>
-          <w:rFonts w:ascii="Calibri" w:hAnsi="Calibri"/>
-          <w:b/>
-          <w:color w:val="111827"/>
-          <w:sz w:val="21"/>
-        </w:rPr>
-        <w:t>Berth Handling Throughput</w:t>
-      </w:r>
-      <w:r>
-        <w:rPr>
-          <w:rFonts w:ascii="Calibri" w:hAnsi="Calibri"/>
-          <w:sz w:val="21"/>
-        </w:rPr>
-        <w:t>:</w:t>
-      </w:r>
-    </w:p>
-    <w:p>
-      <w:pPr>
-        <w:spacing w:before="40" w:after="80"/>
-      </w:pPr>
-      <w:r>
-        <w:rPr>
-          <w:rFonts w:ascii="Calibri" w:hAnsi="Calibri"/>
-          <w:sz w:val="21"/>
-        </w:rPr>
-        <w:t xml:space="preserve">   $$\sum_{v \in V} x_{v, t} \le \text{MaxDailyArrivals}_P \quad \forall t \in T$$</w:t>
-      </w:r>
-    </w:p>
-    <w:p>
-      <w:pPr>
-        <w:spacing w:before="40" w:after="80"/>
-      </w:pPr>
-      <w:r>
-        <w:rPr>
-          <w:rFonts w:ascii="Calibri" w:hAnsi="Calibri"/>
-          <w:sz w:val="21"/>
-        </w:rPr>
-        <w:t>---</w:t>
-      </w:r>
-    </w:p>
-    <w:p>
-      <w:pPr>
-        <w:pStyle w:val="Heading3"/>
-        <w:spacing w:before="160" w:after="60"/>
-      </w:pPr>
-      <w:r>
-        <w:rPr>
-          <w:rFonts w:ascii="Calibri" w:hAnsi="Calibri"/>
-          <w:b/>
-          <w:color w:val="2B4C7E"/>
-          <w:sz w:val="24"/>
-        </w:rPr>
-        <w:t>Layer 6: Enterprise Command Center UI (`frontend/`)</w:t>
-      </w:r>
-    </w:p>
-    <w:p>
-      <w:pPr>
-        <w:pStyle w:val="ListBullet"/>
-        <w:spacing w:before="20" w:after="20"/>
-        <w:ind w:left="360"/>
-      </w:pPr>
-      <w:r>
-        <w:rPr>
-          <w:rFonts w:ascii="Calibri" w:hAnsi="Calibri"/>
-          <w:b/>
-          <w:color w:val="111827"/>
-          <w:sz w:val="21"/>
-        </w:rPr>
-        <w:t>Next.js 14 App Router</w:t>
-      </w:r>
-      <w:r>
-        <w:rPr>
-          <w:rFonts w:ascii="Calibri" w:hAnsi="Calibri"/>
-          <w:sz w:val="21"/>
-        </w:rPr>
-        <w:t xml:space="preserve"> with TypeScript and Server-Side Rendering (SSR).</w:t>
-      </w:r>
-    </w:p>
-    <w:p>
-      <w:pPr>
-        <w:pStyle w:val="ListBullet"/>
-        <w:spacing w:before="20" w:after="20"/>
-        <w:ind w:left="360"/>
-      </w:pPr>
-      <w:r>
-        <w:rPr>
-          <w:rFonts w:ascii="Calibri" w:hAnsi="Calibri"/>
-          <w:b/>
-          <w:color w:val="111827"/>
-          <w:sz w:val="21"/>
-        </w:rPr>
-        <w:t>Styling</w:t>
-      </w:r>
-      <w:r>
-        <w:rPr>
-          <w:rFonts w:ascii="Calibri" w:hAnsi="Calibri"/>
-          <w:sz w:val="21"/>
-        </w:rPr>
-        <w:t>: Tailwind CSS configured with a neutral dark graphite palette (</w:t>
-      </w:r>
-      <w:r>
-        <w:rPr>
-          <w:rFonts w:ascii="Consolas" w:hAnsi="Consolas"/>
-          <w:color w:val="1E40AF"/>
-          <w:sz w:val="19"/>
-        </w:rPr>
-        <w:t>#090a0f</w:t>
-      </w:r>
-      <w:r>
-        <w:rPr>
-          <w:rFonts w:ascii="Calibri" w:hAnsi="Calibri"/>
-          <w:sz w:val="21"/>
-        </w:rPr>
-        <w:t xml:space="preserve">, </w:t>
-      </w:r>
-      <w:r>
-        <w:rPr>
-          <w:rFonts w:ascii="Consolas" w:hAnsi="Consolas"/>
-          <w:color w:val="1E40AF"/>
-          <w:sz w:val="19"/>
-        </w:rPr>
-        <w:t>#12131a</w:t>
-      </w:r>
-      <w:r>
-        <w:rPr>
-          <w:rFonts w:ascii="Calibri" w:hAnsi="Calibri"/>
-          <w:sz w:val="21"/>
-        </w:rPr>
-        <w:t xml:space="preserve">, </w:t>
-      </w:r>
-      <w:r>
-        <w:rPr>
-          <w:rFonts w:ascii="Consolas" w:hAnsi="Consolas"/>
-          <w:color w:val="1E40AF"/>
-          <w:sz w:val="19"/>
-        </w:rPr>
-        <w:t>#222430</w:t>
-      </w:r>
-      <w:r>
-        <w:rPr>
-          <w:rFonts w:ascii="Calibri" w:hAnsi="Calibri"/>
-          <w:sz w:val="21"/>
-        </w:rPr>
-        <w:t>) compliant with National Command Center and Bloomberg Terminal standards.</w:t>
-      </w:r>
-    </w:p>
-    <w:p>
-      <w:pPr>
-        <w:pStyle w:val="ListBullet"/>
-        <w:spacing w:before="20" w:after="20"/>
-        <w:ind w:left="360"/>
-      </w:pPr>
-      <w:r>
-        <w:rPr>
-          <w:rFonts w:ascii="Calibri" w:hAnsi="Calibri"/>
-          <w:b/>
-          <w:color w:val="111827"/>
-          <w:sz w:val="21"/>
-        </w:rPr>
-        <w:t>Data Visualization</w:t>
-      </w:r>
-      <w:r>
-        <w:rPr>
-          <w:rFonts w:ascii="Calibri" w:hAnsi="Calibri"/>
-          <w:sz w:val="21"/>
-        </w:rPr>
-        <w:t>: Recharts ComposedChart rendering forward curves, confidence bands, and dual-currency (USD &amp; ₹ Crore) KPI cards.</w:t>
-      </w:r>
-    </w:p>
-    <w:p>
-      <w:pPr>
-        <w:pStyle w:val="ListBullet"/>
-        <w:spacing w:before="20" w:after="20"/>
-        <w:ind w:left="360"/>
-      </w:pPr>
-      <w:r>
-        <w:rPr>
-          <w:rFonts w:ascii="Calibri" w:hAnsi="Calibri"/>
-          <w:b/>
-          <w:color w:val="111827"/>
-          <w:sz w:val="21"/>
-        </w:rPr>
-        <w:t>Hydration Safe</w:t>
-      </w:r>
-      <w:r>
-        <w:rPr>
-          <w:rFonts w:ascii="Calibri" w:hAnsi="Calibri"/>
-          <w:sz w:val="21"/>
-        </w:rPr>
-        <w:t xml:space="preserve">: Deterministic formatting with pinned </w:t>
-      </w:r>
-      <w:r>
-        <w:rPr>
-          <w:rFonts w:ascii="Consolas" w:hAnsi="Consolas"/>
-          <w:color w:val="1E40AF"/>
-          <w:sz w:val="19"/>
-        </w:rPr>
-        <w:t>en-US</w:t>
-      </w:r>
-      <w:r>
-        <w:rPr>
-          <w:rFonts w:ascii="Calibri" w:hAnsi="Calibri"/>
-          <w:sz w:val="21"/>
-        </w:rPr>
-        <w:t xml:space="preserve"> and </w:t>
-      </w:r>
-      <w:r>
-        <w:rPr>
-          <w:rFonts w:ascii="Consolas" w:hAnsi="Consolas"/>
-          <w:color w:val="1E40AF"/>
-          <w:sz w:val="19"/>
-        </w:rPr>
-        <w:t>en-IN</w:t>
-      </w:r>
-      <w:r>
-        <w:rPr>
-          <w:rFonts w:ascii="Calibri" w:hAnsi="Calibri"/>
-          <w:sz w:val="21"/>
-        </w:rPr>
-        <w:t xml:space="preserve"> number formatting.</w:t>
-      </w:r>
-    </w:p>
-    <w:p>
-      <w:pPr>
-        <w:spacing w:before="40" w:after="80"/>
-      </w:pPr>
-      <w:r>
-        <w:rPr>
-          <w:rFonts w:ascii="Calibri" w:hAnsi="Calibri"/>
-          <w:sz w:val="21"/>
-        </w:rPr>
-        <w:t>---</w:t>
-      </w:r>
-    </w:p>
-    <w:p>
-      <w:pPr>
-        <w:pStyle w:val="Heading2"/>
-        <w:spacing w:before="200" w:after="80"/>
-      </w:pPr>
-      <w:r>
-        <w:rPr>
-          <w:rFonts w:ascii="Calibri" w:hAnsi="Calibri"/>
-          <w:b/>
-          <w:color w:val="1B365D"/>
-          <w:sz w:val="28"/>
-        </w:rPr>
-        <w:t>3. Data Flow Diagram</w:t>
-      </w:r>
-    </w:p>
-    <w:p>
-      <w:pPr>
-        <w:spacing w:before="80" w:after="120"/>
-        <w:ind w:left="360"/>
-      </w:pPr>
-      <w:r>
-        <w:rPr>
-          <w:rFonts w:ascii="Consolas" w:hAnsi="Consolas"/>
-          <w:color w:val="1F2937"/>
-          <w:sz w:val="18"/>
-        </w:rPr>
-        <w:t>[ Market Feeds / Port Telemetry ]</w:t>
-        <w:br/>
-        <w:t xml:space="preserve">               │</w:t>
-        <w:br/>
-        <w:t xml:space="preserve">               ▼ (fetch_market_data.py / seed_database.py)</w:t>
-        <w:br/>
-        <w:t>[ PostgreSQL + TimescaleDB ]</w:t>
-        <w:br/>
-        <w:t xml:space="preserve">               │</w:t>
-        <w:br/>
-        <w:t xml:space="preserve">               ▼ (SQLAlchemy Async Queries)</w:t>
-        <w:br/>
-        <w:t>[ FastAPI Backend /api/v1/ ]</w:t>
-        <w:br/>
-        <w:t xml:space="preserve">       │                      │</w:t>
-        <w:br/>
-        <w:t xml:space="preserve">       ▼ (/forecasts/{index}) ▼ (/optimize)</w:t>
-        <w:br/>
-        <w:t>[ Hybrid ML Forecaster ]   [ PuLP CBC MILP Solver ]</w:t>
-        <w:br/>
-        <w:t xml:space="preserve">       │                      │</w:t>
-        <w:br/>
-        <w:t xml:space="preserve">       └──────────┬───────────┘</w:t>
-        <w:br/>
-        <w:t xml:space="preserve">                  ▼</w:t>
-        <w:br/>
-        <w:t>[ Next.js 14 Interactive Dashboard ]</w:t>
+        <w:t>Database and API schemas are designed with role-based attributes ready for OAuth2/JWT integration across Procurement Officers, Logistics Directors, and External Auditors.</w:t>
       </w:r>
     </w:p>
     <w:sectPr>
@@ -2529,11 +1830,6 @@
     <w:name w:val="Normal"/>
     <w:qFormat/>
     <w:rsid w:val="00FC693F"/>
-    <w:rPr>
-      <w:rFonts w:ascii="Calibri" w:hAnsi="Calibri"/>
-      <w:color w:val="222222"/>
-      <w:sz w:val="21"/>
-    </w:rPr>
   </w:style>
   <w:style w:type="paragraph" w:styleId="Header">
     <w:name w:val="header"/>

</xml_diff>